<commit_message>
Update 2. Chemie Klausur 25.02.2026.docx
Aufbau von Polymerketten hinzugefügt
Alle Thementitel sind eingetragen
</commit_message>
<xml_diff>
--- a/WIP/2. Chemie Klausur 25.02.2026.docx
+++ b/WIP/2. Chemie Klausur 25.02.2026.docx
@@ -448,7 +448,7 @@
                     </pic:cNvPicPr>
                   </pic:nvPicPr>
                   <pic:blipFill>
-                    <a:blip r:embed="rId4" cstate="print">
+                    <a:blip r:embed="rId5" cstate="print">
                       <a:extLst>
                         <a:ext uri="{28A0092B-C50C-407E-A947-70E740481C1C}">
                           <a14:useLocalDpi xmlns:a14="http://schemas.microsoft.com/office/drawing/2010/main" val="0"/>
@@ -1416,7 +1416,7 @@
                           <pic:cNvPicPr/>
                         </pic:nvPicPr>
                         <pic:blipFill>
-                          <a:blip r:embed="rId5"/>
+                          <a:blip r:embed="rId6"/>
                           <a:stretch>
                             <a:fillRect/>
                           </a:stretch>
@@ -1506,7 +1506,7 @@
                           <pic:cNvPicPr/>
                         </pic:nvPicPr>
                         <pic:blipFill>
-                          <a:blip r:embed="rId6"/>
+                          <a:blip r:embed="rId7"/>
                           <a:stretch>
                             <a:fillRect/>
                           </a:stretch>
@@ -1585,7 +1585,7 @@
                           <pic:cNvPicPr/>
                         </pic:nvPicPr>
                         <pic:blipFill>
-                          <a:blip r:embed="rId7"/>
+                          <a:blip r:embed="rId8"/>
                           <a:stretch>
                             <a:fillRect/>
                           </a:stretch>
@@ -2123,6 +2123,9 @@
         </w:rPr>
         <w:t>Vorteile und Nachteile der Verwendung von Kunststoffen</w:t>
       </w:r>
+      <w:r>
+        <w:t xml:space="preserve"> </w:t>
+      </w:r>
     </w:p>
     <w:tbl>
       <w:tblPr>
@@ -2193,19 +2196,18 @@
           </w:tcPr>
           <w:p>
             <w:pPr>
-              <w:jc w:val="center"/>
-              <w:rPr>
-                <w:rFonts w:ascii="Roboto" w:hAnsi="Roboto"/>
-                <w:sz w:val="32"/>
-                <w:szCs w:val="32"/>
+              <w:rPr>
+                <w:rFonts w:ascii="Roboto" w:hAnsi="Roboto"/>
+                <w:sz w:val="28"/>
+                <w:szCs w:val="28"/>
                 <w:lang w:val="de-DE"/>
               </w:rPr>
             </w:pPr>
             <w:r>
               <w:rPr>
                 <w:rFonts w:ascii="Roboto" w:hAnsi="Roboto"/>
-                <w:sz w:val="32"/>
-                <w:szCs w:val="32"/>
+                <w:sz w:val="28"/>
+                <w:szCs w:val="28"/>
                 <w:lang w:val="de-DE"/>
               </w:rPr>
               <w:t>Niedriges spezifisches Gewicht</w:t>
@@ -2218,19 +2220,18 @@
           </w:tcPr>
           <w:p>
             <w:pPr>
-              <w:jc w:val="center"/>
-              <w:rPr>
-                <w:rFonts w:ascii="Roboto" w:hAnsi="Roboto"/>
-                <w:sz w:val="32"/>
-                <w:szCs w:val="32"/>
+              <w:rPr>
+                <w:rFonts w:ascii="Roboto" w:hAnsi="Roboto"/>
+                <w:sz w:val="28"/>
+                <w:szCs w:val="28"/>
                 <w:lang w:val="de-DE"/>
               </w:rPr>
             </w:pPr>
             <w:r>
               <w:rPr>
                 <w:rFonts w:ascii="Roboto" w:hAnsi="Roboto"/>
-                <w:sz w:val="32"/>
-                <w:szCs w:val="32"/>
+                <w:sz w:val="28"/>
+                <w:szCs w:val="28"/>
                 <w:lang w:val="de-DE"/>
               </w:rPr>
               <w:t>Meist nur geringe mechanische Festigkeit</w:t>
@@ -2245,19 +2246,18 @@
           </w:tcPr>
           <w:p>
             <w:pPr>
-              <w:jc w:val="center"/>
-              <w:rPr>
-                <w:rFonts w:ascii="Roboto" w:hAnsi="Roboto"/>
-                <w:sz w:val="32"/>
-                <w:szCs w:val="32"/>
+              <w:rPr>
+                <w:rFonts w:ascii="Roboto" w:hAnsi="Roboto"/>
+                <w:sz w:val="28"/>
+                <w:szCs w:val="28"/>
                 <w:lang w:val="de-DE"/>
               </w:rPr>
             </w:pPr>
             <w:r>
               <w:rPr>
                 <w:rFonts w:ascii="Roboto" w:hAnsi="Roboto"/>
-                <w:sz w:val="32"/>
-                <w:szCs w:val="32"/>
+                <w:sz w:val="28"/>
+                <w:szCs w:val="28"/>
                 <w:lang w:val="de-DE"/>
               </w:rPr>
               <w:t>Hohe Beständigkeit gegen Korrosion und Verrottung</w:t>
@@ -2270,19 +2270,18 @@
           </w:tcPr>
           <w:p>
             <w:pPr>
-              <w:jc w:val="center"/>
-              <w:rPr>
-                <w:rFonts w:ascii="Roboto" w:hAnsi="Roboto"/>
-                <w:sz w:val="32"/>
-                <w:szCs w:val="32"/>
+              <w:rPr>
+                <w:rFonts w:ascii="Roboto" w:hAnsi="Roboto"/>
+                <w:sz w:val="28"/>
+                <w:szCs w:val="28"/>
                 <w:lang w:val="de-DE"/>
               </w:rPr>
             </w:pPr>
             <w:r>
               <w:rPr>
                 <w:rFonts w:ascii="Roboto" w:hAnsi="Roboto"/>
-                <w:sz w:val="32"/>
-                <w:szCs w:val="32"/>
+                <w:sz w:val="28"/>
+                <w:szCs w:val="28"/>
                 <w:lang w:val="de-DE"/>
               </w:rPr>
               <w:t>Meist nur geringe Formbeständigkeit in der Wärme und Wärmestandfestigkeit</w:t>
@@ -2297,19 +2296,18 @@
           </w:tcPr>
           <w:p>
             <w:pPr>
-              <w:jc w:val="center"/>
-              <w:rPr>
-                <w:rFonts w:ascii="Roboto" w:hAnsi="Roboto"/>
-                <w:sz w:val="32"/>
-                <w:szCs w:val="32"/>
+              <w:rPr>
+                <w:rFonts w:ascii="Roboto" w:hAnsi="Roboto"/>
+                <w:sz w:val="28"/>
+                <w:szCs w:val="28"/>
                 <w:lang w:val="de-DE"/>
               </w:rPr>
             </w:pPr>
             <w:r>
               <w:rPr>
                 <w:rFonts w:ascii="Roboto" w:hAnsi="Roboto"/>
-                <w:sz w:val="32"/>
-                <w:szCs w:val="32"/>
+                <w:sz w:val="28"/>
+                <w:szCs w:val="28"/>
                 <w:lang w:val="de-DE"/>
               </w:rPr>
               <w:t>Hohe elektrische Isolierfähigkeit, Wärmeschutzwirkung und Dämmwirkung gegen Schall</w:t>
@@ -2322,19 +2320,18 @@
           </w:tcPr>
           <w:p>
             <w:pPr>
-              <w:jc w:val="center"/>
-              <w:rPr>
-                <w:rFonts w:ascii="Roboto" w:hAnsi="Roboto"/>
-                <w:sz w:val="32"/>
-                <w:szCs w:val="32"/>
+              <w:rPr>
+                <w:rFonts w:ascii="Roboto" w:hAnsi="Roboto"/>
+                <w:sz w:val="28"/>
+                <w:szCs w:val="28"/>
                 <w:lang w:val="de-DE"/>
               </w:rPr>
             </w:pPr>
             <w:r>
               <w:rPr>
                 <w:rFonts w:ascii="Roboto" w:hAnsi="Roboto"/>
-                <w:sz w:val="32"/>
-                <w:szCs w:val="32"/>
+                <w:sz w:val="28"/>
+                <w:szCs w:val="28"/>
                 <w:lang w:val="de-DE"/>
               </w:rPr>
               <w:t>Anfälligkeit gegen Alterung, d. h.: Beeinträchtigung der physikalischen Eigenschaften unter Einwirkung von Licht und Wärme</w:t>
@@ -2349,19 +2346,18 @@
           </w:tcPr>
           <w:p>
             <w:pPr>
-              <w:jc w:val="center"/>
-              <w:rPr>
-                <w:rFonts w:ascii="Roboto" w:hAnsi="Roboto"/>
-                <w:sz w:val="32"/>
-                <w:szCs w:val="32"/>
+              <w:rPr>
+                <w:rFonts w:ascii="Roboto" w:hAnsi="Roboto"/>
+                <w:sz w:val="28"/>
+                <w:szCs w:val="28"/>
                 <w:lang w:val="de-DE"/>
               </w:rPr>
             </w:pPr>
             <w:r>
               <w:rPr>
                 <w:rFonts w:ascii="Roboto" w:hAnsi="Roboto"/>
-                <w:sz w:val="32"/>
-                <w:szCs w:val="32"/>
+                <w:sz w:val="28"/>
+                <w:szCs w:val="28"/>
                 <w:lang w:val="de-DE"/>
               </w:rPr>
               <w:t>Leichte Formgebung und wirtschaftliche Verarbeitbarkeit, deshalb idealer Werkstoff für die Massenfertigung</w:t>
@@ -2374,19 +2370,18 @@
           </w:tcPr>
           <w:p>
             <w:pPr>
-              <w:jc w:val="center"/>
-              <w:rPr>
-                <w:rFonts w:ascii="Roboto" w:hAnsi="Roboto"/>
-                <w:sz w:val="32"/>
-                <w:szCs w:val="32"/>
+              <w:rPr>
+                <w:rFonts w:ascii="Roboto" w:hAnsi="Roboto"/>
+                <w:sz w:val="28"/>
+                <w:szCs w:val="28"/>
                 <w:lang w:val="de-DE"/>
               </w:rPr>
             </w:pPr>
             <w:r>
               <w:rPr>
                 <w:rFonts w:ascii="Roboto" w:hAnsi="Roboto"/>
-                <w:sz w:val="32"/>
-                <w:szCs w:val="32"/>
+                <w:sz w:val="28"/>
+                <w:szCs w:val="28"/>
                 <w:lang w:val="de-DE"/>
               </w:rPr>
               <w:t>Wegen ihrer organischen Natur sind meisten Kunststoffe brennbar</w:t>
@@ -2401,19 +2396,18 @@
           </w:tcPr>
           <w:p>
             <w:pPr>
-              <w:jc w:val="center"/>
-              <w:rPr>
-                <w:rFonts w:ascii="Roboto" w:hAnsi="Roboto"/>
-                <w:sz w:val="32"/>
-                <w:szCs w:val="32"/>
+              <w:rPr>
+                <w:rFonts w:ascii="Roboto" w:hAnsi="Roboto"/>
+                <w:sz w:val="28"/>
+                <w:szCs w:val="28"/>
                 <w:lang w:val="de-DE"/>
               </w:rPr>
             </w:pPr>
             <w:r>
               <w:rPr>
                 <w:rFonts w:ascii="Roboto" w:hAnsi="Roboto"/>
-                <w:sz w:val="32"/>
-                <w:szCs w:val="32"/>
+                <w:sz w:val="28"/>
+                <w:szCs w:val="28"/>
                 <w:lang w:val="de-DE"/>
               </w:rPr>
               <w:t xml:space="preserve">Farbfreudigkeit; in vielen leuchtenden Farben in der Masse </w:t>
@@ -2422,8 +2416,8 @@
             <w:r>
               <w:rPr>
                 <w:rFonts w:ascii="Roboto" w:hAnsi="Roboto"/>
-                <w:sz w:val="32"/>
-                <w:szCs w:val="32"/>
+                <w:sz w:val="28"/>
+                <w:szCs w:val="28"/>
                 <w:lang w:val="de-DE"/>
               </w:rPr>
               <w:t>einfärbbar</w:t>
@@ -2432,8 +2426,8 @@
             <w:r>
               <w:rPr>
                 <w:rFonts w:ascii="Roboto" w:hAnsi="Roboto"/>
-                <w:sz w:val="32"/>
-                <w:szCs w:val="32"/>
+                <w:sz w:val="28"/>
+                <w:szCs w:val="28"/>
                 <w:lang w:val="de-DE"/>
               </w:rPr>
               <w:t xml:space="preserve">, bedruck- und </w:t>
@@ -2442,8 +2436,8 @@
             <w:r>
               <w:rPr>
                 <w:rFonts w:ascii="Roboto" w:hAnsi="Roboto"/>
-                <w:sz w:val="32"/>
-                <w:szCs w:val="32"/>
+                <w:sz w:val="28"/>
+                <w:szCs w:val="28"/>
                 <w:lang w:val="de-DE"/>
               </w:rPr>
               <w:t>metallisierbar</w:t>
@@ -2452,21 +2446,11 @@
             <w:r>
               <w:rPr>
                 <w:rFonts w:ascii="Roboto" w:hAnsi="Roboto"/>
-                <w:sz w:val="32"/>
-                <w:szCs w:val="32"/>
-                <w:lang w:val="de-DE"/>
-              </w:rPr>
-              <w:t xml:space="preserve"> breites </w:t>
-            </w:r>
-            <w:r>
-              <w:rPr>
-                <w:rFonts w:ascii="Roboto" w:hAnsi="Roboto"/>
-                <w:sz w:val="32"/>
-                <w:szCs w:val="32"/>
-                <w:lang w:val="de-DE"/>
-              </w:rPr>
-              <w:lastRenderedPageBreak/>
-              <w:t>Angebot preiswerter Rohstoffe</w:t>
+                <w:sz w:val="28"/>
+                <w:szCs w:val="28"/>
+                <w:lang w:val="de-DE"/>
+              </w:rPr>
+              <w:t xml:space="preserve"> breites Angebot preiswerter Rohstoffe</w:t>
             </w:r>
           </w:p>
         </w:tc>
@@ -2476,22 +2460,20 @@
           </w:tcPr>
           <w:p>
             <w:pPr>
-              <w:jc w:val="center"/>
-              <w:rPr>
-                <w:rFonts w:ascii="Roboto" w:hAnsi="Roboto"/>
-                <w:sz w:val="32"/>
-                <w:szCs w:val="32"/>
+              <w:rPr>
+                <w:rFonts w:ascii="Roboto" w:hAnsi="Roboto"/>
+                <w:sz w:val="28"/>
+                <w:szCs w:val="28"/>
                 <w:lang w:val="de-DE"/>
               </w:rPr>
             </w:pPr>
             <w:r>
               <w:rPr>
                 <w:rFonts w:ascii="Roboto" w:hAnsi="Roboto"/>
-                <w:sz w:val="32"/>
-                <w:szCs w:val="32"/>
-                <w:lang w:val="de-DE"/>
-              </w:rPr>
-              <w:lastRenderedPageBreak/>
+                <w:sz w:val="28"/>
+                <w:szCs w:val="28"/>
+                <w:lang w:val="de-DE"/>
+              </w:rPr>
               <w:t>Schwierig auszubessern, Reparatur lohnt sich nur selten</w:t>
             </w:r>
           </w:p>
@@ -2514,6 +2496,1384 @@
         <w:jc w:val="center"/>
         <w:rPr>
           <w:rFonts w:ascii="Roboto" w:hAnsi="Roboto"/>
+          <w:color w:val="806000" w:themeColor="accent4" w:themeShade="80"/>
+          <w:sz w:val="36"/>
+          <w:szCs w:val="36"/>
+          <w:lang w:val="de-DE"/>
+        </w:rPr>
+      </w:pPr>
+    </w:p>
+    <w:p>
+      <w:pPr>
+        <w:jc w:val="center"/>
+        <w:rPr>
+          <w:rFonts w:ascii="Roboto" w:hAnsi="Roboto"/>
+          <w:color w:val="806000" w:themeColor="accent4" w:themeShade="80"/>
+          <w:sz w:val="36"/>
+          <w:szCs w:val="36"/>
+          <w:lang w:val="de-DE"/>
+        </w:rPr>
+      </w:pPr>
+    </w:p>
+    <w:p>
+      <w:pPr>
+        <w:jc w:val="center"/>
+        <w:rPr>
+          <w:rFonts w:ascii="Roboto" w:hAnsi="Roboto"/>
+          <w:color w:val="806000" w:themeColor="accent4" w:themeShade="80"/>
+          <w:sz w:val="36"/>
+          <w:szCs w:val="36"/>
+          <w:lang w:val="de-DE"/>
+        </w:rPr>
+      </w:pPr>
+      <w:r>
+        <w:rPr>
+          <w:rFonts w:ascii="Roboto" w:hAnsi="Roboto"/>
+          <w:color w:val="806000" w:themeColor="accent4" w:themeShade="80"/>
+          <w:sz w:val="36"/>
+          <w:szCs w:val="36"/>
+          <w:lang w:val="de-DE"/>
+        </w:rPr>
+        <w:lastRenderedPageBreak/>
+        <w:t>Aufbau</w:t>
+      </w:r>
+      <w:r>
+        <w:rPr>
+          <w:rFonts w:ascii="Roboto" w:hAnsi="Roboto"/>
+          <w:color w:val="806000" w:themeColor="accent4" w:themeShade="80"/>
+          <w:sz w:val="36"/>
+          <w:szCs w:val="36"/>
+          <w:lang w:val="de-DE"/>
+        </w:rPr>
+        <w:t xml:space="preserve"> der Polymerketten</w:t>
+      </w:r>
+    </w:p>
+    <w:p>
+      <w:pPr>
+        <w:jc w:val="center"/>
+        <w:rPr>
+          <w:rFonts w:ascii="Roboto" w:hAnsi="Roboto"/>
+          <w:sz w:val="32"/>
+          <w:szCs w:val="32"/>
+          <w:lang w:val="de-DE"/>
+        </w:rPr>
+      </w:pPr>
+      <w:r>
+        <w:rPr>
+          <w:rFonts w:ascii="Roboto" w:hAnsi="Roboto"/>
+          <w:b/>
+          <w:bCs/>
+          <w:sz w:val="32"/>
+          <w:szCs w:val="32"/>
+          <w:lang w:val="de-DE"/>
+        </w:rPr>
+        <w:t>Homopolymere</w:t>
+      </w:r>
+      <w:r>
+        <w:rPr>
+          <w:rFonts w:ascii="Roboto" w:hAnsi="Roboto"/>
+          <w:sz w:val="32"/>
+          <w:szCs w:val="32"/>
+          <w:lang w:val="de-DE"/>
+        </w:rPr>
+        <w:t xml:space="preserve"> sind aus nur einem </w:t>
+      </w:r>
+      <w:r>
+        <w:rPr>
+          <w:rFonts w:ascii="Roboto" w:hAnsi="Roboto"/>
+          <w:b/>
+          <w:bCs/>
+          <w:color w:val="ED7D31" w:themeColor="accent2"/>
+          <w:sz w:val="32"/>
+          <w:szCs w:val="32"/>
+          <w:lang w:val="de-DE"/>
+        </w:rPr>
+        <w:t>einzigem Monomer</w:t>
+      </w:r>
+      <w:r>
+        <w:rPr>
+          <w:rFonts w:ascii="Roboto" w:hAnsi="Roboto"/>
+          <w:color w:val="ED7D31" w:themeColor="accent2"/>
+          <w:sz w:val="32"/>
+          <w:szCs w:val="32"/>
+          <w:lang w:val="de-DE"/>
+        </w:rPr>
+        <w:t xml:space="preserve"> </w:t>
+      </w:r>
+      <w:r>
+        <w:rPr>
+          <w:rFonts w:ascii="Roboto" w:hAnsi="Roboto"/>
+          <w:sz w:val="32"/>
+          <w:szCs w:val="32"/>
+          <w:lang w:val="de-DE"/>
+        </w:rPr>
+        <w:t>aufgebaut.</w:t>
+      </w:r>
+    </w:p>
+    <w:p>
+      <w:pPr>
+        <w:jc w:val="center"/>
+        <w:rPr>
+          <w:rFonts w:ascii="Roboto" w:hAnsi="Roboto"/>
+          <w:sz w:val="32"/>
+          <w:szCs w:val="32"/>
+          <w:lang w:val="de-DE"/>
+        </w:rPr>
+      </w:pPr>
+      <w:r>
+        <w:rPr>
+          <w:rFonts w:ascii="Roboto" w:hAnsi="Roboto"/>
+          <w:noProof/>
+          <w:sz w:val="32"/>
+          <w:szCs w:val="32"/>
+          <w:lang w:val="de-DE"/>
+        </w:rPr>
+        <w:drawing>
+          <wp:inline distT="0" distB="0" distL="0" distR="0" wp14:anchorId="3179D251" wp14:editId="4E9D69DD">
+            <wp:extent cx="5756910" cy="600075"/>
+            <wp:effectExtent l="76200" t="76200" r="129540" b="142875"/>
+            <wp:docPr id="2141879638" name="Resim 1"/>
+            <wp:cNvGraphicFramePr>
+              <a:graphicFrameLocks xmlns:a="http://schemas.openxmlformats.org/drawingml/2006/main" noChangeAspect="1"/>
+            </wp:cNvGraphicFramePr>
+            <a:graphic xmlns:a="http://schemas.openxmlformats.org/drawingml/2006/main">
+              <a:graphicData uri="http://schemas.openxmlformats.org/drawingml/2006/picture">
+                <pic:pic xmlns:pic="http://schemas.openxmlformats.org/drawingml/2006/picture">
+                  <pic:nvPicPr>
+                    <pic:cNvPr id="0" name="Picture 8"/>
+                    <pic:cNvPicPr>
+                      <a:picLocks noChangeAspect="1" noChangeArrowheads="1"/>
+                    </pic:cNvPicPr>
+                  </pic:nvPicPr>
+                  <pic:blipFill>
+                    <a:blip r:embed="rId9">
+                      <a:extLst>
+                        <a:ext uri="{28A0092B-C50C-407E-A947-70E740481C1C}">
+                          <a14:useLocalDpi xmlns:a14="http://schemas.microsoft.com/office/drawing/2010/main" val="0"/>
+                        </a:ext>
+                      </a:extLst>
+                    </a:blip>
+                    <a:srcRect/>
+                    <a:stretch>
+                      <a:fillRect/>
+                    </a:stretch>
+                  </pic:blipFill>
+                  <pic:spPr bwMode="auto">
+                    <a:xfrm>
+                      <a:off x="0" y="0"/>
+                      <a:ext cx="5756910" cy="600075"/>
+                    </a:xfrm>
+                    <a:prstGeom prst="rect">
+                      <a:avLst/>
+                    </a:prstGeom>
+                    <a:ln w="38100" cap="sq">
+                      <a:solidFill>
+                        <a:srgbClr val="000000"/>
+                      </a:solidFill>
+                      <a:prstDash val="solid"/>
+                      <a:miter lim="800000"/>
+                    </a:ln>
+                    <a:effectLst>
+                      <a:outerShdw blurRad="50800" dist="38100" dir="2700000" algn="tl" rotWithShape="0">
+                        <a:srgbClr val="000000">
+                          <a:alpha val="43000"/>
+                        </a:srgbClr>
+                      </a:outerShdw>
+                    </a:effectLst>
+                  </pic:spPr>
+                </pic:pic>
+              </a:graphicData>
+            </a:graphic>
+          </wp:inline>
+        </w:drawing>
+      </w:r>
+    </w:p>
+    <w:p>
+      <w:pPr>
+        <w:jc w:val="center"/>
+        <w:rPr>
+          <w:rFonts w:ascii="Roboto" w:hAnsi="Roboto"/>
+          <w:sz w:val="32"/>
+          <w:szCs w:val="32"/>
+          <w:lang w:val="de-DE"/>
+        </w:rPr>
+      </w:pPr>
+    </w:p>
+    <w:p>
+      <w:pPr>
+        <w:jc w:val="center"/>
+        <w:rPr>
+          <w:rFonts w:ascii="Roboto" w:hAnsi="Roboto"/>
+          <w:b/>
+          <w:bCs/>
+          <w:sz w:val="32"/>
+          <w:szCs w:val="32"/>
+          <w:lang w:val="de-DE"/>
+        </w:rPr>
+      </w:pPr>
+      <w:r>
+        <w:rPr>
+          <w:rFonts w:ascii="Roboto" w:hAnsi="Roboto"/>
+          <w:sz w:val="32"/>
+          <w:szCs w:val="32"/>
+          <w:lang w:val="de-DE"/>
+        </w:rPr>
+        <w:t xml:space="preserve">Wird das Polymer hingegen aus zwei oder mehr Monomeren aufgebaut spricht man von einem </w:t>
+      </w:r>
+      <w:r>
+        <w:rPr>
+          <w:rFonts w:ascii="Roboto" w:hAnsi="Roboto"/>
+          <w:b/>
+          <w:bCs/>
+          <w:sz w:val="32"/>
+          <w:szCs w:val="32"/>
+          <w:lang w:val="de-DE"/>
+        </w:rPr>
+        <w:t>Copolymer</w:t>
+      </w:r>
+      <w:r>
+        <w:rPr>
+          <w:rFonts w:ascii="Roboto" w:hAnsi="Roboto"/>
+          <w:b/>
+          <w:bCs/>
+          <w:sz w:val="32"/>
+          <w:szCs w:val="32"/>
+          <w:lang w:val="de-DE"/>
+        </w:rPr>
+        <w:t>:</w:t>
+      </w:r>
+    </w:p>
+    <w:p>
+      <w:pPr>
+        <w:rPr>
+          <w:rFonts w:ascii="Roboto" w:hAnsi="Roboto"/>
+          <w:sz w:val="32"/>
+          <w:szCs w:val="32"/>
+          <w:lang w:val="de-DE"/>
+        </w:rPr>
+      </w:pPr>
+      <w:r>
+        <w:rPr>
+          <w:rFonts w:ascii="Roboto" w:hAnsi="Roboto"/>
+          <w:b/>
+          <w:bCs/>
+          <w:sz w:val="32"/>
+          <w:szCs w:val="32"/>
+          <w:lang w:val="de-DE"/>
+        </w:rPr>
+        <w:sym w:font="Wingdings" w:char="F0E0"/>
+      </w:r>
+      <w:r>
+        <w:rPr>
+          <w:rFonts w:ascii="Roboto" w:hAnsi="Roboto"/>
+          <w:b/>
+          <w:bCs/>
+          <w:sz w:val="32"/>
+          <w:szCs w:val="32"/>
+          <w:lang w:val="de-DE"/>
+        </w:rPr>
+        <w:t xml:space="preserve"> </w:t>
+      </w:r>
+      <w:r>
+        <w:rPr>
+          <w:rFonts w:ascii="Roboto" w:hAnsi="Roboto"/>
+          <w:sz w:val="32"/>
+          <w:szCs w:val="32"/>
+          <w:lang w:val="de-DE"/>
+        </w:rPr>
+        <w:t xml:space="preserve">Bei einem </w:t>
+      </w:r>
+      <w:r>
+        <w:rPr>
+          <w:rFonts w:ascii="Roboto" w:hAnsi="Roboto"/>
+          <w:b/>
+          <w:bCs/>
+          <w:color w:val="ED7D31" w:themeColor="accent2"/>
+          <w:sz w:val="32"/>
+          <w:szCs w:val="32"/>
+          <w:lang w:val="de-DE"/>
+        </w:rPr>
+        <w:t>s</w:t>
+      </w:r>
+      <w:r>
+        <w:rPr>
+          <w:rFonts w:ascii="Roboto" w:hAnsi="Roboto"/>
+          <w:b/>
+          <w:bCs/>
+          <w:color w:val="00B0F0"/>
+          <w:sz w:val="32"/>
+          <w:szCs w:val="32"/>
+          <w:lang w:val="de-DE"/>
+        </w:rPr>
+        <w:t>t</w:t>
+      </w:r>
+      <w:r>
+        <w:rPr>
+          <w:rFonts w:ascii="Roboto" w:hAnsi="Roboto"/>
+          <w:b/>
+          <w:bCs/>
+          <w:color w:val="ED7D31" w:themeColor="accent2"/>
+          <w:sz w:val="32"/>
+          <w:szCs w:val="32"/>
+          <w:lang w:val="de-DE"/>
+        </w:rPr>
+        <w:t>ati</w:t>
+      </w:r>
+      <w:r>
+        <w:rPr>
+          <w:rFonts w:ascii="Roboto" w:hAnsi="Roboto"/>
+          <w:b/>
+          <w:bCs/>
+          <w:color w:val="00B0F0"/>
+          <w:sz w:val="32"/>
+          <w:szCs w:val="32"/>
+          <w:lang w:val="de-DE"/>
+        </w:rPr>
+        <w:t>sc</w:t>
+      </w:r>
+      <w:r>
+        <w:rPr>
+          <w:rFonts w:ascii="Roboto" w:hAnsi="Roboto"/>
+          <w:b/>
+          <w:bCs/>
+          <w:color w:val="ED7D31" w:themeColor="accent2"/>
+          <w:sz w:val="32"/>
+          <w:szCs w:val="32"/>
+          <w:lang w:val="de-DE"/>
+        </w:rPr>
+        <w:t>h</w:t>
+      </w:r>
+      <w:r>
+        <w:rPr>
+          <w:rFonts w:ascii="Roboto" w:hAnsi="Roboto"/>
+          <w:b/>
+          <w:bCs/>
+          <w:color w:val="00B0F0"/>
+          <w:sz w:val="32"/>
+          <w:szCs w:val="32"/>
+          <w:lang w:val="de-DE"/>
+        </w:rPr>
+        <w:t>en</w:t>
+      </w:r>
+      <w:r>
+        <w:rPr>
+          <w:rFonts w:ascii="Roboto" w:hAnsi="Roboto"/>
+          <w:sz w:val="32"/>
+          <w:szCs w:val="32"/>
+          <w:lang w:val="de-DE"/>
+        </w:rPr>
+        <w:t xml:space="preserve"> </w:t>
+      </w:r>
+      <w:r>
+        <w:rPr>
+          <w:rFonts w:ascii="Roboto" w:hAnsi="Roboto"/>
+          <w:b/>
+          <w:bCs/>
+          <w:sz w:val="32"/>
+          <w:szCs w:val="32"/>
+          <w:lang w:val="de-DE"/>
+        </w:rPr>
+        <w:t>Copolymer</w:t>
+      </w:r>
+      <w:r>
+        <w:rPr>
+          <w:rFonts w:ascii="Roboto" w:hAnsi="Roboto"/>
+          <w:sz w:val="32"/>
+          <w:szCs w:val="32"/>
+          <w:lang w:val="de-DE"/>
+        </w:rPr>
+        <w:t xml:space="preserve"> aus </w:t>
+      </w:r>
+      <w:r>
+        <w:rPr>
+          <w:rFonts w:ascii="Roboto" w:hAnsi="Roboto"/>
+          <w:b/>
+          <w:bCs/>
+          <w:color w:val="ED7D31" w:themeColor="accent2"/>
+          <w:sz w:val="32"/>
+          <w:szCs w:val="32"/>
+          <w:lang w:val="de-DE"/>
+          <w14:textOutline w14:w="9525" w14:cap="rnd" w14:cmpd="sng" w14:algn="ctr">
+            <w14:solidFill>
+              <w14:srgbClr w14:val="00B0F0"/>
+            </w14:solidFill>
+            <w14:prstDash w14:val="solid"/>
+            <w14:bevel/>
+          </w14:textOutline>
+        </w:rPr>
+        <w:t>zwei</w:t>
+      </w:r>
+      <w:r>
+        <w:rPr>
+          <w:rFonts w:ascii="Roboto" w:hAnsi="Roboto"/>
+          <w:color w:val="ED7D31" w:themeColor="accent2"/>
+          <w:sz w:val="32"/>
+          <w:szCs w:val="32"/>
+          <w:lang w:val="de-DE"/>
+          <w14:textOutline w14:w="9525" w14:cap="rnd" w14:cmpd="sng" w14:algn="ctr">
+            <w14:solidFill>
+              <w14:srgbClr w14:val="00B0F0"/>
+            </w14:solidFill>
+            <w14:prstDash w14:val="solid"/>
+            <w14:bevel/>
+          </w14:textOutline>
+        </w:rPr>
+        <w:t xml:space="preserve"> </w:t>
+      </w:r>
+      <w:r>
+        <w:rPr>
+          <w:rFonts w:ascii="Roboto" w:hAnsi="Roboto"/>
+          <w:b/>
+          <w:bCs/>
+          <w:color w:val="ED7D31" w:themeColor="accent2"/>
+          <w:sz w:val="32"/>
+          <w:szCs w:val="32"/>
+          <w:lang w:val="de-DE"/>
+          <w14:textOutline w14:w="9525" w14:cap="rnd" w14:cmpd="sng" w14:algn="ctr">
+            <w14:solidFill>
+              <w14:srgbClr w14:val="00B0F0"/>
+            </w14:solidFill>
+            <w14:prstDash w14:val="solid"/>
+            <w14:bevel/>
+          </w14:textOutline>
+        </w:rPr>
+        <w:t>Monomeren</w:t>
+      </w:r>
+      <w:r>
+        <w:rPr>
+          <w:rFonts w:ascii="Roboto" w:hAnsi="Roboto"/>
+          <w:color w:val="ED7D31" w:themeColor="accent2"/>
+          <w:sz w:val="32"/>
+          <w:szCs w:val="32"/>
+          <w:lang w:val="de-DE"/>
+          <w14:textOutline w14:w="9525" w14:cap="rnd" w14:cmpd="sng" w14:algn="ctr">
+            <w14:solidFill>
+              <w14:srgbClr w14:val="00B0F0"/>
+            </w14:solidFill>
+            <w14:prstDash w14:val="solid"/>
+            <w14:bevel/>
+          </w14:textOutline>
+        </w:rPr>
+        <w:t xml:space="preserve"> </w:t>
+      </w:r>
+      <w:r>
+        <w:rPr>
+          <w:rFonts w:ascii="Roboto" w:hAnsi="Roboto"/>
+          <w:sz w:val="32"/>
+          <w:szCs w:val="32"/>
+          <w:lang w:val="de-DE"/>
+        </w:rPr>
+        <w:t>ist die Rei</w:t>
+      </w:r>
+      <w:r>
+        <w:rPr>
+          <w:rFonts w:ascii="Roboto" w:hAnsi="Roboto"/>
+          <w:sz w:val="32"/>
+          <w:szCs w:val="32"/>
+          <w:lang w:val="de-DE"/>
+        </w:rPr>
+        <w:t>h</w:t>
+      </w:r>
+      <w:r>
+        <w:rPr>
+          <w:rFonts w:ascii="Roboto" w:hAnsi="Roboto"/>
+          <w:sz w:val="32"/>
+          <w:szCs w:val="32"/>
+          <w:lang w:val="de-DE"/>
+        </w:rPr>
+        <w:t>enfolge der verknüpften Monomere rein zufällig:</w:t>
+      </w:r>
+    </w:p>
+    <w:p>
+      <w:pPr>
+        <w:rPr>
+          <w:rFonts w:ascii="Roboto" w:hAnsi="Roboto"/>
+          <w:sz w:val="32"/>
+          <w:szCs w:val="32"/>
+          <w:lang w:val="de-DE"/>
+        </w:rPr>
+      </w:pPr>
+      <w:r>
+        <w:rPr>
+          <w:rFonts w:ascii="Roboto" w:hAnsi="Roboto"/>
+          <w:sz w:val="32"/>
+          <w:szCs w:val="32"/>
+          <w:lang w:val="de-DE"/>
+        </w:rPr>
+        <w:drawing>
+          <wp:inline distT="0" distB="0" distL="0" distR="0" wp14:anchorId="0390C7DC" wp14:editId="15C23A04">
+            <wp:extent cx="5760720" cy="646430"/>
+            <wp:effectExtent l="76200" t="76200" r="125730" b="134620"/>
+            <wp:docPr id="1958085729" name="Resim 1"/>
+            <wp:cNvGraphicFramePr>
+              <a:graphicFrameLocks xmlns:a="http://schemas.openxmlformats.org/drawingml/2006/main" noChangeAspect="1"/>
+            </wp:cNvGraphicFramePr>
+            <a:graphic xmlns:a="http://schemas.openxmlformats.org/drawingml/2006/main">
+              <a:graphicData uri="http://schemas.openxmlformats.org/drawingml/2006/picture">
+                <pic:pic xmlns:pic="http://schemas.openxmlformats.org/drawingml/2006/picture">
+                  <pic:nvPicPr>
+                    <pic:cNvPr id="1958085729" name=""/>
+                    <pic:cNvPicPr/>
+                  </pic:nvPicPr>
+                  <pic:blipFill>
+                    <a:blip r:embed="rId10"/>
+                    <a:stretch>
+                      <a:fillRect/>
+                    </a:stretch>
+                  </pic:blipFill>
+                  <pic:spPr>
+                    <a:xfrm>
+                      <a:off x="0" y="0"/>
+                      <a:ext cx="5760720" cy="646430"/>
+                    </a:xfrm>
+                    <a:prstGeom prst="rect">
+                      <a:avLst/>
+                    </a:prstGeom>
+                    <a:ln w="38100" cap="sq">
+                      <a:solidFill>
+                        <a:srgbClr val="000000"/>
+                      </a:solidFill>
+                      <a:prstDash val="solid"/>
+                      <a:miter lim="800000"/>
+                    </a:ln>
+                    <a:effectLst>
+                      <a:outerShdw blurRad="50800" dist="38100" dir="2700000" algn="tl" rotWithShape="0">
+                        <a:srgbClr val="000000">
+                          <a:alpha val="43000"/>
+                        </a:srgbClr>
+                      </a:outerShdw>
+                    </a:effectLst>
+                  </pic:spPr>
+                </pic:pic>
+              </a:graphicData>
+            </a:graphic>
+          </wp:inline>
+        </w:drawing>
+      </w:r>
+    </w:p>
+    <w:p>
+      <w:pPr>
+        <w:rPr>
+          <w:rFonts w:ascii="Roboto" w:hAnsi="Roboto"/>
+          <w:sz w:val="32"/>
+          <w:szCs w:val="32"/>
+          <w:lang w:val="de-DE"/>
+        </w:rPr>
+      </w:pPr>
+    </w:p>
+    <w:p>
+      <w:pPr>
+        <w:rPr>
+          <w:rFonts w:ascii="Roboto" w:hAnsi="Roboto"/>
+          <w:sz w:val="32"/>
+          <w:szCs w:val="32"/>
+          <w:lang w:val="de-DE"/>
+        </w:rPr>
+      </w:pPr>
+      <w:r>
+        <w:rPr>
+          <w:rFonts w:ascii="Roboto" w:hAnsi="Roboto"/>
+          <w:sz w:val="32"/>
+          <w:szCs w:val="32"/>
+          <w:lang w:val="de-DE"/>
+        </w:rPr>
+        <w:sym w:font="Wingdings" w:char="F0E0"/>
+      </w:r>
+      <w:r>
+        <w:rPr>
+          <w:rFonts w:ascii="Roboto" w:hAnsi="Roboto"/>
+          <w:sz w:val="32"/>
+          <w:szCs w:val="32"/>
+          <w:lang w:val="de-DE"/>
+        </w:rPr>
+        <w:t xml:space="preserve">Bei einem </w:t>
+      </w:r>
+      <w:r>
+        <w:rPr>
+          <w:rFonts w:ascii="Roboto" w:hAnsi="Roboto"/>
+          <w:b/>
+          <w:bCs/>
+          <w:color w:val="ED7D31" w:themeColor="accent2"/>
+          <w:sz w:val="32"/>
+          <w:szCs w:val="32"/>
+          <w:lang w:val="de-DE"/>
+        </w:rPr>
+        <w:t>a</w:t>
+      </w:r>
+      <w:r>
+        <w:rPr>
+          <w:rFonts w:ascii="Roboto" w:hAnsi="Roboto"/>
+          <w:b/>
+          <w:bCs/>
+          <w:color w:val="00B0F0"/>
+          <w:sz w:val="32"/>
+          <w:szCs w:val="32"/>
+          <w:lang w:val="de-DE"/>
+        </w:rPr>
+        <w:t>l</w:t>
+      </w:r>
+      <w:r>
+        <w:rPr>
+          <w:rFonts w:ascii="Roboto" w:hAnsi="Roboto"/>
+          <w:b/>
+          <w:bCs/>
+          <w:color w:val="ED7D31" w:themeColor="accent2"/>
+          <w:sz w:val="32"/>
+          <w:szCs w:val="32"/>
+          <w:lang w:val="de-DE"/>
+        </w:rPr>
+        <w:t>t</w:t>
+      </w:r>
+      <w:r>
+        <w:rPr>
+          <w:rFonts w:ascii="Roboto" w:hAnsi="Roboto"/>
+          <w:b/>
+          <w:bCs/>
+          <w:color w:val="00B0F0"/>
+          <w:sz w:val="32"/>
+          <w:szCs w:val="32"/>
+          <w:lang w:val="de-DE"/>
+        </w:rPr>
+        <w:t>e</w:t>
+      </w:r>
+      <w:r>
+        <w:rPr>
+          <w:rFonts w:ascii="Roboto" w:hAnsi="Roboto"/>
+          <w:b/>
+          <w:bCs/>
+          <w:color w:val="ED7D31" w:themeColor="accent2"/>
+          <w:sz w:val="32"/>
+          <w:szCs w:val="32"/>
+          <w:lang w:val="de-DE"/>
+        </w:rPr>
+        <w:t>r</w:t>
+      </w:r>
+      <w:r>
+        <w:rPr>
+          <w:rFonts w:ascii="Roboto" w:hAnsi="Roboto"/>
+          <w:b/>
+          <w:bCs/>
+          <w:color w:val="00B0F0"/>
+          <w:sz w:val="32"/>
+          <w:szCs w:val="32"/>
+          <w:lang w:val="de-DE"/>
+        </w:rPr>
+        <w:t>n</w:t>
+      </w:r>
+      <w:r>
+        <w:rPr>
+          <w:rFonts w:ascii="Roboto" w:hAnsi="Roboto"/>
+          <w:b/>
+          <w:bCs/>
+          <w:color w:val="ED7D31" w:themeColor="accent2"/>
+          <w:sz w:val="32"/>
+          <w:szCs w:val="32"/>
+          <w:lang w:val="de-DE"/>
+        </w:rPr>
+        <w:t>i</w:t>
+      </w:r>
+      <w:r>
+        <w:rPr>
+          <w:rFonts w:ascii="Roboto" w:hAnsi="Roboto"/>
+          <w:b/>
+          <w:bCs/>
+          <w:color w:val="00B0F0"/>
+          <w:sz w:val="32"/>
+          <w:szCs w:val="32"/>
+          <w:lang w:val="de-DE"/>
+        </w:rPr>
+        <w:t>e</w:t>
+      </w:r>
+      <w:r>
+        <w:rPr>
+          <w:rFonts w:ascii="Roboto" w:hAnsi="Roboto"/>
+          <w:b/>
+          <w:bCs/>
+          <w:color w:val="ED7D31" w:themeColor="accent2"/>
+          <w:sz w:val="32"/>
+          <w:szCs w:val="32"/>
+          <w:lang w:val="de-DE"/>
+        </w:rPr>
+        <w:t>r</w:t>
+      </w:r>
+      <w:r>
+        <w:rPr>
+          <w:rFonts w:ascii="Roboto" w:hAnsi="Roboto"/>
+          <w:b/>
+          <w:bCs/>
+          <w:color w:val="00B0F0"/>
+          <w:sz w:val="32"/>
+          <w:szCs w:val="32"/>
+          <w:lang w:val="de-DE"/>
+        </w:rPr>
+        <w:t>e</w:t>
+      </w:r>
+      <w:r>
+        <w:rPr>
+          <w:rFonts w:ascii="Roboto" w:hAnsi="Roboto"/>
+          <w:b/>
+          <w:bCs/>
+          <w:color w:val="ED7D31" w:themeColor="accent2"/>
+          <w:sz w:val="32"/>
+          <w:szCs w:val="32"/>
+          <w:lang w:val="de-DE"/>
+        </w:rPr>
+        <w:t>n</w:t>
+      </w:r>
+      <w:r>
+        <w:rPr>
+          <w:rFonts w:ascii="Roboto" w:hAnsi="Roboto"/>
+          <w:b/>
+          <w:bCs/>
+          <w:color w:val="00B0F0"/>
+          <w:sz w:val="32"/>
+          <w:szCs w:val="32"/>
+          <w:lang w:val="de-DE"/>
+        </w:rPr>
+        <w:t>d</w:t>
+      </w:r>
+      <w:r>
+        <w:rPr>
+          <w:rFonts w:ascii="Roboto" w:hAnsi="Roboto"/>
+          <w:b/>
+          <w:bCs/>
+          <w:color w:val="ED7D31" w:themeColor="accent2"/>
+          <w:sz w:val="32"/>
+          <w:szCs w:val="32"/>
+          <w:lang w:val="de-DE"/>
+        </w:rPr>
+        <w:t>e</w:t>
+      </w:r>
+      <w:r>
+        <w:rPr>
+          <w:rFonts w:ascii="Roboto" w:hAnsi="Roboto"/>
+          <w:b/>
+          <w:bCs/>
+          <w:color w:val="00B0F0"/>
+          <w:sz w:val="32"/>
+          <w:szCs w:val="32"/>
+          <w:lang w:val="de-DE"/>
+        </w:rPr>
+        <w:t>n</w:t>
+      </w:r>
+      <w:r>
+        <w:rPr>
+          <w:rFonts w:ascii="Roboto" w:hAnsi="Roboto"/>
+          <w:sz w:val="32"/>
+          <w:szCs w:val="32"/>
+          <w:lang w:val="de-DE"/>
+        </w:rPr>
+        <w:t xml:space="preserve"> </w:t>
+      </w:r>
+      <w:r>
+        <w:rPr>
+          <w:rFonts w:ascii="Roboto" w:hAnsi="Roboto"/>
+          <w:b/>
+          <w:bCs/>
+          <w:sz w:val="32"/>
+          <w:szCs w:val="32"/>
+          <w:lang w:val="de-DE"/>
+        </w:rPr>
+        <w:t>Copolymer</w:t>
+      </w:r>
+      <w:r>
+        <w:rPr>
+          <w:rFonts w:ascii="Roboto" w:hAnsi="Roboto"/>
+          <w:sz w:val="32"/>
+          <w:szCs w:val="32"/>
+          <w:lang w:val="de-DE"/>
+        </w:rPr>
+        <w:t xml:space="preserve"> aus </w:t>
+      </w:r>
+      <w:r>
+        <w:rPr>
+          <w:rFonts w:ascii="Roboto" w:hAnsi="Roboto"/>
+          <w:b/>
+          <w:bCs/>
+          <w:color w:val="ED7D31" w:themeColor="accent2"/>
+          <w:sz w:val="32"/>
+          <w:szCs w:val="32"/>
+          <w:lang w:val="de-DE"/>
+          <w14:textOutline w14:w="9525" w14:cap="rnd" w14:cmpd="sng" w14:algn="ctr">
+            <w14:solidFill>
+              <w14:srgbClr w14:val="00B0F0"/>
+            </w14:solidFill>
+            <w14:prstDash w14:val="solid"/>
+            <w14:bevel/>
+          </w14:textOutline>
+        </w:rPr>
+        <w:t>zwei Monomeren</w:t>
+      </w:r>
+      <w:r>
+        <w:rPr>
+          <w:rFonts w:ascii="Roboto" w:hAnsi="Roboto"/>
+          <w:color w:val="ED7D31" w:themeColor="accent2"/>
+          <w:sz w:val="32"/>
+          <w:szCs w:val="32"/>
+          <w:lang w:val="de-DE"/>
+          <w14:textOutline w14:w="9525" w14:cap="rnd" w14:cmpd="sng" w14:algn="ctr">
+            <w14:solidFill>
+              <w14:srgbClr w14:val="00B0F0"/>
+            </w14:solidFill>
+            <w14:prstDash w14:val="solid"/>
+            <w14:bevel/>
+          </w14:textOutline>
+        </w:rPr>
+        <w:t xml:space="preserve"> </w:t>
+      </w:r>
+      <w:r>
+        <w:rPr>
+          <w:rFonts w:ascii="Roboto" w:hAnsi="Roboto"/>
+          <w:sz w:val="32"/>
+          <w:szCs w:val="32"/>
+          <w:lang w:val="de-DE"/>
+        </w:rPr>
+        <w:t xml:space="preserve">wechseln sich die </w:t>
+      </w:r>
+      <w:r>
+        <w:rPr>
+          <w:rFonts w:ascii="Roboto" w:hAnsi="Roboto"/>
+          <w:b/>
+          <w:bCs/>
+          <w:sz w:val="32"/>
+          <w:szCs w:val="32"/>
+          <w:lang w:val="de-DE"/>
+        </w:rPr>
+        <w:t>Monomere</w:t>
+      </w:r>
+      <w:r>
+        <w:rPr>
+          <w:rFonts w:ascii="Roboto" w:hAnsi="Roboto"/>
+          <w:sz w:val="32"/>
+          <w:szCs w:val="32"/>
+          <w:lang w:val="de-DE"/>
+        </w:rPr>
+        <w:t xml:space="preserve"> </w:t>
+      </w:r>
+      <w:r>
+        <w:rPr>
+          <w:rFonts w:ascii="Roboto" w:hAnsi="Roboto"/>
+          <w:b/>
+          <w:bCs/>
+          <w:color w:val="ED7D31" w:themeColor="accent2"/>
+          <w:sz w:val="32"/>
+          <w:szCs w:val="32"/>
+          <w:lang w:val="de-DE"/>
+        </w:rPr>
+        <w:t>A</w:t>
+      </w:r>
+      <w:r>
+        <w:rPr>
+          <w:rFonts w:ascii="Roboto" w:hAnsi="Roboto"/>
+          <w:sz w:val="32"/>
+          <w:szCs w:val="32"/>
+          <w:lang w:val="de-DE"/>
+        </w:rPr>
+        <w:t xml:space="preserve"> und </w:t>
+      </w:r>
+      <w:r>
+        <w:rPr>
+          <w:rFonts w:ascii="Roboto" w:hAnsi="Roboto"/>
+          <w:b/>
+          <w:bCs/>
+          <w:color w:val="00B0F0"/>
+          <w:sz w:val="32"/>
+          <w:szCs w:val="32"/>
+          <w:lang w:val="de-DE"/>
+        </w:rPr>
+        <w:t>B</w:t>
+      </w:r>
+      <w:r>
+        <w:rPr>
+          <w:rFonts w:ascii="Roboto" w:hAnsi="Roboto"/>
+          <w:sz w:val="32"/>
+          <w:szCs w:val="32"/>
+          <w:lang w:val="de-DE"/>
+        </w:rPr>
+        <w:t xml:space="preserve"> in der Reihenfolge ständig ab:</w:t>
+      </w:r>
+    </w:p>
+    <w:p>
+      <w:pPr>
+        <w:rPr>
+          <w:rFonts w:ascii="Roboto" w:hAnsi="Roboto"/>
+          <w:sz w:val="32"/>
+          <w:szCs w:val="32"/>
+          <w:lang w:val="de-DE"/>
+        </w:rPr>
+      </w:pPr>
+      <w:r>
+        <w:rPr>
+          <w:rFonts w:ascii="Roboto" w:hAnsi="Roboto"/>
+          <w:sz w:val="32"/>
+          <w:szCs w:val="32"/>
+          <w:lang w:val="de-DE"/>
+        </w:rPr>
+        <w:drawing>
+          <wp:inline distT="0" distB="0" distL="0" distR="0" wp14:anchorId="5D3CD6E5" wp14:editId="275F907D">
+            <wp:extent cx="5760720" cy="622935"/>
+            <wp:effectExtent l="76200" t="76200" r="125730" b="139065"/>
+            <wp:docPr id="541708126" name="Resim 1"/>
+            <wp:cNvGraphicFramePr>
+              <a:graphicFrameLocks xmlns:a="http://schemas.openxmlformats.org/drawingml/2006/main" noChangeAspect="1"/>
+            </wp:cNvGraphicFramePr>
+            <a:graphic xmlns:a="http://schemas.openxmlformats.org/drawingml/2006/main">
+              <a:graphicData uri="http://schemas.openxmlformats.org/drawingml/2006/picture">
+                <pic:pic xmlns:pic="http://schemas.openxmlformats.org/drawingml/2006/picture">
+                  <pic:nvPicPr>
+                    <pic:cNvPr id="541708126" name=""/>
+                    <pic:cNvPicPr/>
+                  </pic:nvPicPr>
+                  <pic:blipFill>
+                    <a:blip r:embed="rId11"/>
+                    <a:stretch>
+                      <a:fillRect/>
+                    </a:stretch>
+                  </pic:blipFill>
+                  <pic:spPr>
+                    <a:xfrm>
+                      <a:off x="0" y="0"/>
+                      <a:ext cx="5760720" cy="622935"/>
+                    </a:xfrm>
+                    <a:prstGeom prst="rect">
+                      <a:avLst/>
+                    </a:prstGeom>
+                    <a:ln w="38100" cap="sq">
+                      <a:solidFill>
+                        <a:srgbClr val="000000"/>
+                      </a:solidFill>
+                      <a:prstDash val="solid"/>
+                      <a:miter lim="800000"/>
+                    </a:ln>
+                    <a:effectLst>
+                      <a:outerShdw blurRad="50800" dist="38100" dir="2700000" algn="tl" rotWithShape="0">
+                        <a:srgbClr val="000000">
+                          <a:alpha val="43000"/>
+                        </a:srgbClr>
+                      </a:outerShdw>
+                    </a:effectLst>
+                  </pic:spPr>
+                </pic:pic>
+              </a:graphicData>
+            </a:graphic>
+          </wp:inline>
+        </w:drawing>
+      </w:r>
+    </w:p>
+    <w:p>
+      <w:pPr>
+        <w:rPr>
+          <w:rFonts w:ascii="Roboto" w:hAnsi="Roboto"/>
+          <w:sz w:val="32"/>
+          <w:szCs w:val="32"/>
+          <w:lang w:val="de-DE"/>
+        </w:rPr>
+      </w:pPr>
+    </w:p>
+    <w:p>
+      <w:pPr>
+        <w:rPr>
+          <w:rFonts w:ascii="Roboto" w:hAnsi="Roboto"/>
+          <w:sz w:val="32"/>
+          <w:szCs w:val="32"/>
+          <w:lang w:val="de-DE"/>
+        </w:rPr>
+      </w:pPr>
+      <w:r>
+        <w:rPr>
+          <w:rFonts w:ascii="Roboto" w:hAnsi="Roboto"/>
+          <w:sz w:val="32"/>
+          <w:szCs w:val="32"/>
+          <w:lang w:val="de-DE"/>
+        </w:rPr>
+        <w:sym w:font="Wingdings" w:char="F0E0"/>
+      </w:r>
+      <w:r>
+        <w:rPr>
+          <w:rFonts w:ascii="Roboto" w:hAnsi="Roboto"/>
+          <w:sz w:val="32"/>
+          <w:szCs w:val="32"/>
+          <w:lang w:val="de-DE"/>
+        </w:rPr>
+        <w:t xml:space="preserve"> In </w:t>
+      </w:r>
+      <w:r>
+        <w:rPr>
+          <w:rFonts w:ascii="Roboto" w:hAnsi="Roboto"/>
+          <w:b/>
+          <w:bCs/>
+          <w:color w:val="ED7D31" w:themeColor="accent2"/>
+          <w:sz w:val="32"/>
+          <w:szCs w:val="32"/>
+          <w:lang w:val="de-DE"/>
+        </w:rPr>
+        <w:t>Block</w:t>
+      </w:r>
+      <w:r>
+        <w:rPr>
+          <w:rFonts w:ascii="Roboto" w:hAnsi="Roboto"/>
+          <w:b/>
+          <w:bCs/>
+          <w:color w:val="00B0F0"/>
+          <w:sz w:val="32"/>
+          <w:szCs w:val="32"/>
+          <w:lang w:val="de-DE"/>
+        </w:rPr>
+        <w:t>polymeren</w:t>
+      </w:r>
+      <w:r>
+        <w:rPr>
+          <w:rFonts w:ascii="Roboto" w:hAnsi="Roboto"/>
+          <w:sz w:val="32"/>
+          <w:szCs w:val="32"/>
+          <w:lang w:val="de-DE"/>
+        </w:rPr>
+        <w:t xml:space="preserve"> aus zwei Monomeren sind die </w:t>
+      </w:r>
+      <w:r>
+        <w:rPr>
+          <w:rFonts w:ascii="Roboto" w:hAnsi="Roboto"/>
+          <w:b/>
+          <w:bCs/>
+          <w:color w:val="ED7D31" w:themeColor="accent2"/>
+          <w:sz w:val="32"/>
+          <w:szCs w:val="32"/>
+          <w:lang w:val="de-DE"/>
+          <w14:textOutline w14:w="9525" w14:cap="rnd" w14:cmpd="sng" w14:algn="ctr">
+            <w14:solidFill>
+              <w14:srgbClr w14:val="00B0F0"/>
+            </w14:solidFill>
+            <w14:prstDash w14:val="solid"/>
+            <w14:bevel/>
+          </w14:textOutline>
+        </w:rPr>
+        <w:t>einheitlichen</w:t>
+      </w:r>
+      <w:r>
+        <w:rPr>
+          <w:rFonts w:ascii="Roboto" w:hAnsi="Roboto"/>
+          <w:color w:val="ED7D31" w:themeColor="accent2"/>
+          <w:sz w:val="32"/>
+          <w:szCs w:val="32"/>
+          <w:lang w:val="de-DE"/>
+          <w14:textOutline w14:w="9525" w14:cap="rnd" w14:cmpd="sng" w14:algn="ctr">
+            <w14:solidFill>
+              <w14:srgbClr w14:val="00B0F0"/>
+            </w14:solidFill>
+            <w14:prstDash w14:val="solid"/>
+            <w14:bevel/>
+          </w14:textOutline>
+        </w:rPr>
+        <w:t xml:space="preserve"> </w:t>
+      </w:r>
+      <w:r>
+        <w:rPr>
+          <w:rFonts w:ascii="Roboto" w:hAnsi="Roboto"/>
+          <w:b/>
+          <w:bCs/>
+          <w:color w:val="ED7D31" w:themeColor="accent2"/>
+          <w:sz w:val="32"/>
+          <w:szCs w:val="32"/>
+          <w:lang w:val="de-DE"/>
+          <w14:textOutline w14:w="9525" w14:cap="rnd" w14:cmpd="sng" w14:algn="ctr">
+            <w14:solidFill>
+              <w14:srgbClr w14:val="00B0F0"/>
+            </w14:solidFill>
+            <w14:prstDash w14:val="solid"/>
+            <w14:bevel/>
+          </w14:textOutline>
+        </w:rPr>
+        <w:t>Monomere</w:t>
+      </w:r>
+      <w:r>
+        <w:rPr>
+          <w:rFonts w:ascii="Roboto" w:hAnsi="Roboto"/>
+          <w:color w:val="ED7D31" w:themeColor="accent2"/>
+          <w:sz w:val="32"/>
+          <w:szCs w:val="32"/>
+          <w:lang w:val="de-DE"/>
+          <w14:textOutline w14:w="9525" w14:cap="rnd" w14:cmpd="sng" w14:algn="ctr">
+            <w14:solidFill>
+              <w14:srgbClr w14:val="00B0F0"/>
+            </w14:solidFill>
+            <w14:prstDash w14:val="solid"/>
+            <w14:bevel/>
+          </w14:textOutline>
+        </w:rPr>
+        <w:t xml:space="preserve"> </w:t>
+      </w:r>
+      <w:r>
+        <w:rPr>
+          <w:rFonts w:ascii="Roboto" w:hAnsi="Roboto"/>
+          <w:b/>
+          <w:bCs/>
+          <w:sz w:val="32"/>
+          <w:szCs w:val="32"/>
+          <w:lang w:val="de-DE"/>
+        </w:rPr>
+        <w:t>blockweise</w:t>
+      </w:r>
+      <w:r>
+        <w:rPr>
+          <w:rFonts w:ascii="Roboto" w:hAnsi="Roboto"/>
+          <w:sz w:val="32"/>
+          <w:szCs w:val="32"/>
+          <w:lang w:val="de-DE"/>
+        </w:rPr>
+        <w:t xml:space="preserve"> </w:t>
+      </w:r>
+      <w:r>
+        <w:rPr>
+          <w:rFonts w:ascii="Roboto" w:hAnsi="Roboto"/>
+          <w:b/>
+          <w:bCs/>
+          <w:sz w:val="32"/>
+          <w:szCs w:val="32"/>
+          <w:lang w:val="de-DE"/>
+        </w:rPr>
+        <w:t>zusammengefasst</w:t>
+      </w:r>
+      <w:r>
+        <w:rPr>
+          <w:rFonts w:ascii="Roboto" w:hAnsi="Roboto"/>
+          <w:sz w:val="32"/>
+          <w:szCs w:val="32"/>
+          <w:lang w:val="de-DE"/>
+        </w:rPr>
+        <w:t xml:space="preserve"> und wechseln einander ab:</w:t>
+      </w:r>
+    </w:p>
+    <w:p>
+      <w:pPr>
+        <w:rPr>
+          <w:rFonts w:ascii="Roboto" w:hAnsi="Roboto"/>
+          <w:sz w:val="32"/>
+          <w:szCs w:val="32"/>
+          <w:lang w:val="de-DE"/>
+        </w:rPr>
+      </w:pPr>
+      <w:r>
+        <w:rPr>
+          <w:rFonts w:ascii="Roboto" w:hAnsi="Roboto"/>
+          <w:sz w:val="32"/>
+          <w:szCs w:val="32"/>
+          <w:lang w:val="de-DE"/>
+        </w:rPr>
+        <w:drawing>
+          <wp:inline distT="0" distB="0" distL="0" distR="0" wp14:anchorId="1D82159C" wp14:editId="0C843FBF">
+            <wp:extent cx="5760720" cy="605790"/>
+            <wp:effectExtent l="76200" t="76200" r="125730" b="137160"/>
+            <wp:docPr id="66498340" name="Resim 1"/>
+            <wp:cNvGraphicFramePr>
+              <a:graphicFrameLocks xmlns:a="http://schemas.openxmlformats.org/drawingml/2006/main" noChangeAspect="1"/>
+            </wp:cNvGraphicFramePr>
+            <a:graphic xmlns:a="http://schemas.openxmlformats.org/drawingml/2006/main">
+              <a:graphicData uri="http://schemas.openxmlformats.org/drawingml/2006/picture">
+                <pic:pic xmlns:pic="http://schemas.openxmlformats.org/drawingml/2006/picture">
+                  <pic:nvPicPr>
+                    <pic:cNvPr id="66498340" name=""/>
+                    <pic:cNvPicPr/>
+                  </pic:nvPicPr>
+                  <pic:blipFill>
+                    <a:blip r:embed="rId12"/>
+                    <a:stretch>
+                      <a:fillRect/>
+                    </a:stretch>
+                  </pic:blipFill>
+                  <pic:spPr>
+                    <a:xfrm>
+                      <a:off x="0" y="0"/>
+                      <a:ext cx="5760720" cy="605790"/>
+                    </a:xfrm>
+                    <a:prstGeom prst="rect">
+                      <a:avLst/>
+                    </a:prstGeom>
+                    <a:ln w="38100" cap="sq">
+                      <a:solidFill>
+                        <a:srgbClr val="000000"/>
+                      </a:solidFill>
+                      <a:prstDash val="solid"/>
+                      <a:miter lim="800000"/>
+                    </a:ln>
+                    <a:effectLst>
+                      <a:outerShdw blurRad="50800" dist="38100" dir="2700000" algn="tl" rotWithShape="0">
+                        <a:srgbClr val="000000">
+                          <a:alpha val="43000"/>
+                        </a:srgbClr>
+                      </a:outerShdw>
+                    </a:effectLst>
+                  </pic:spPr>
+                </pic:pic>
+              </a:graphicData>
+            </a:graphic>
+          </wp:inline>
+        </w:drawing>
+      </w:r>
+    </w:p>
+    <w:p>
+      <w:pPr>
+        <w:rPr>
+          <w:rFonts w:ascii="Roboto" w:hAnsi="Roboto"/>
+          <w:sz w:val="32"/>
+          <w:szCs w:val="32"/>
+          <w:lang w:val="de-DE"/>
+        </w:rPr>
+      </w:pPr>
+      <w:r>
+        <w:rPr>
+          <w:rFonts w:ascii="Roboto" w:hAnsi="Roboto"/>
+          <w:sz w:val="32"/>
+          <w:szCs w:val="32"/>
+          <w:lang w:val="de-DE"/>
+        </w:rPr>
+        <w:lastRenderedPageBreak/>
+        <w:sym w:font="Wingdings" w:char="F0E0"/>
+      </w:r>
+      <w:r>
+        <w:rPr>
+          <w:rFonts w:ascii="Roboto" w:hAnsi="Roboto"/>
+          <w:sz w:val="32"/>
+          <w:szCs w:val="32"/>
+          <w:lang w:val="de-DE"/>
+        </w:rPr>
+        <w:t xml:space="preserve"> </w:t>
+      </w:r>
+      <w:r>
+        <w:rPr>
+          <w:rFonts w:ascii="Roboto" w:hAnsi="Roboto"/>
+          <w:b/>
+          <w:bCs/>
+          <w:color w:val="ED7D31" w:themeColor="accent2"/>
+          <w:sz w:val="32"/>
+          <w:szCs w:val="32"/>
+          <w:lang w:val="de-DE"/>
+          <w14:glow w14:rad="228600">
+            <w14:schemeClr w14:val="accent5">
+              <w14:alpha w14:val="60000"/>
+              <w14:satMod w14:val="175000"/>
+            </w14:schemeClr>
+          </w14:glow>
+          <w14:shadow w14:blurRad="50800" w14:dist="50800" w14:dir="5400000" w14:sx="0" w14:sy="0" w14:kx="0" w14:ky="0" w14:algn="ctr">
+            <w14:srgbClr w14:val="000000"/>
+          </w14:shadow>
+          <w14:props3d w14:extrusionH="0" w14:contourW="0" w14:prstMaterial="warmMatte">
+            <w14:bevelB w14:w="38100" w14:h="38100" w14:prst="relaxedInset"/>
+          </w14:props3d>
+        </w:rPr>
+        <w:t>Pfropfcopolymere</w:t>
+      </w:r>
+      <w:r>
+        <w:rPr>
+          <w:rFonts w:ascii="Roboto" w:hAnsi="Roboto"/>
+          <w:sz w:val="32"/>
+          <w:szCs w:val="32"/>
+          <w:lang w:val="de-DE"/>
+        </w:rPr>
+        <w:t xml:space="preserve"> sind Kunststoffe bei denen Blöcke eines Monomers auf das Gerüst eines anderen Monomers </w:t>
+      </w:r>
+      <w:r>
+        <w:rPr>
+          <w:rFonts w:ascii="Roboto" w:hAnsi="Roboto"/>
+          <w:sz w:val="32"/>
+          <w:szCs w:val="32"/>
+          <w:lang w:val="de-DE"/>
+        </w:rPr>
+        <w:t>aufgepfropft</w:t>
+      </w:r>
+      <w:r>
+        <w:rPr>
+          <w:rFonts w:ascii="Roboto" w:hAnsi="Roboto"/>
+          <w:sz w:val="32"/>
+          <w:szCs w:val="32"/>
+          <w:lang w:val="de-DE"/>
+        </w:rPr>
+        <w:t xml:space="preserve"> sind.</w:t>
+      </w:r>
+    </w:p>
+    <w:p>
+      <w:pPr>
+        <w:jc w:val="center"/>
+        <w:rPr>
+          <w:rFonts w:ascii="Roboto" w:hAnsi="Roboto"/>
+          <w:sz w:val="32"/>
+          <w:szCs w:val="32"/>
+          <w:lang w:val="de-DE"/>
+        </w:rPr>
+      </w:pPr>
+      <w:r>
+        <w:rPr>
+          <w:rFonts w:ascii="Roboto" w:hAnsi="Roboto"/>
+          <w:sz w:val="32"/>
+          <w:szCs w:val="32"/>
+          <w:lang w:val="de-DE"/>
+        </w:rPr>
+        <w:drawing>
+          <wp:inline distT="0" distB="0" distL="0" distR="0" wp14:anchorId="45D3368E" wp14:editId="11AF9CBB">
+            <wp:extent cx="5760720" cy="1621155"/>
+            <wp:effectExtent l="76200" t="76200" r="125730" b="131445"/>
+            <wp:docPr id="1816429829" name="Resim 1"/>
+            <wp:cNvGraphicFramePr>
+              <a:graphicFrameLocks xmlns:a="http://schemas.openxmlformats.org/drawingml/2006/main" noChangeAspect="1"/>
+            </wp:cNvGraphicFramePr>
+            <a:graphic xmlns:a="http://schemas.openxmlformats.org/drawingml/2006/main">
+              <a:graphicData uri="http://schemas.openxmlformats.org/drawingml/2006/picture">
+                <pic:pic xmlns:pic="http://schemas.openxmlformats.org/drawingml/2006/picture">
+                  <pic:nvPicPr>
+                    <pic:cNvPr id="1816429829" name=""/>
+                    <pic:cNvPicPr/>
+                  </pic:nvPicPr>
+                  <pic:blipFill>
+                    <a:blip r:embed="rId13"/>
+                    <a:stretch>
+                      <a:fillRect/>
+                    </a:stretch>
+                  </pic:blipFill>
+                  <pic:spPr>
+                    <a:xfrm>
+                      <a:off x="0" y="0"/>
+                      <a:ext cx="5760720" cy="1621155"/>
+                    </a:xfrm>
+                    <a:prstGeom prst="rect">
+                      <a:avLst/>
+                    </a:prstGeom>
+                    <a:ln w="38100" cap="sq">
+                      <a:solidFill>
+                        <a:srgbClr val="000000"/>
+                      </a:solidFill>
+                      <a:prstDash val="solid"/>
+                      <a:miter lim="800000"/>
+                    </a:ln>
+                    <a:effectLst>
+                      <a:outerShdw blurRad="50800" dist="38100" dir="2700000" algn="tl" rotWithShape="0">
+                        <a:srgbClr val="000000">
+                          <a:alpha val="43000"/>
+                        </a:srgbClr>
+                      </a:outerShdw>
+                    </a:effectLst>
+                  </pic:spPr>
+                </pic:pic>
+              </a:graphicData>
+            </a:graphic>
+          </wp:inline>
+        </w:drawing>
+      </w:r>
+    </w:p>
+    <w:p>
+      <w:pPr>
+        <w:jc w:val="center"/>
+        <w:rPr>
+          <w:rFonts w:ascii="Roboto" w:hAnsi="Roboto"/>
+          <w:sz w:val="32"/>
+          <w:szCs w:val="32"/>
+          <w:lang w:val="de-DE"/>
+        </w:rPr>
+      </w:pPr>
+    </w:p>
+    <w:p>
+      <w:pPr>
+        <w:jc w:val="center"/>
+        <w:rPr>
+          <w:rFonts w:ascii="Roboto" w:hAnsi="Roboto"/>
           <w:color w:val="FF0000"/>
           <w:sz w:val="40"/>
           <w:szCs w:val="40"/>
@@ -2536,12 +3896,220 @@
         <w:jc w:val="center"/>
         <w:rPr>
           <w:rFonts w:ascii="Roboto" w:hAnsi="Roboto"/>
+          <w:color w:val="806000" w:themeColor="accent4" w:themeShade="80"/>
+          <w:sz w:val="36"/>
+          <w:szCs w:val="36"/>
+          <w:lang w:val="de-DE"/>
+        </w:rPr>
+      </w:pPr>
+      <w:r>
+        <w:rPr>
+          <w:rFonts w:ascii="Roboto" w:hAnsi="Roboto"/>
+          <w:color w:val="806000" w:themeColor="accent4" w:themeShade="80"/>
+          <w:sz w:val="36"/>
+          <w:szCs w:val="36"/>
+          <w:lang w:val="de-DE"/>
+        </w:rPr>
+        <w:t>Allgemein</w:t>
+      </w:r>
+    </w:p>
+    <w:p>
+      <w:pPr>
+        <w:jc w:val="center"/>
+        <w:rPr>
+          <w:rFonts w:ascii="Roboto" w:hAnsi="Roboto"/>
+          <w:i/>
+          <w:iCs/>
+          <w:color w:val="44546A" w:themeColor="text2"/>
+          <w:sz w:val="36"/>
+          <w:szCs w:val="36"/>
+          <w:u w:val="single"/>
+          <w:lang w:val="de-DE"/>
+        </w:rPr>
+      </w:pPr>
+      <w:r>
+        <w:rPr>
+          <w:rFonts w:ascii="Roboto" w:hAnsi="Roboto"/>
+          <w:i/>
+          <w:iCs/>
+          <w:color w:val="44546A" w:themeColor="text2"/>
+          <w:sz w:val="36"/>
+          <w:szCs w:val="36"/>
+          <w:u w:val="single"/>
+          <w:lang w:val="de-DE"/>
+        </w:rPr>
+        <w:t>Noch nicht fertig.</w:t>
+      </w:r>
+    </w:p>
+    <w:p>
+      <w:pPr>
+        <w:jc w:val="center"/>
+        <w:rPr>
+          <w:rFonts w:ascii="Roboto" w:hAnsi="Roboto"/>
+          <w:color w:val="806000" w:themeColor="accent4" w:themeShade="80"/>
+          <w:sz w:val="36"/>
+          <w:szCs w:val="36"/>
+          <w:lang w:val="de-DE"/>
+        </w:rPr>
+      </w:pPr>
+      <w:r>
+        <w:rPr>
+          <w:rFonts w:ascii="Roboto" w:hAnsi="Roboto"/>
+          <w:color w:val="806000" w:themeColor="accent4" w:themeShade="80"/>
+          <w:sz w:val="36"/>
+          <w:szCs w:val="36"/>
+          <w:lang w:val="de-DE"/>
+        </w:rPr>
+        <w:t>Radikalische Polymerisation</w:t>
+      </w:r>
+    </w:p>
+    <w:p>
+      <w:pPr>
+        <w:jc w:val="center"/>
+        <w:rPr>
+          <w:rFonts w:ascii="Roboto" w:hAnsi="Roboto"/>
+          <w:i/>
+          <w:iCs/>
+          <w:color w:val="44546A" w:themeColor="text2"/>
+          <w:sz w:val="36"/>
+          <w:szCs w:val="36"/>
+          <w:u w:val="single"/>
+          <w:lang w:val="de-DE"/>
+        </w:rPr>
+      </w:pPr>
+      <w:r>
+        <w:rPr>
+          <w:rFonts w:ascii="Roboto" w:hAnsi="Roboto"/>
+          <w:i/>
+          <w:iCs/>
+          <w:color w:val="44546A" w:themeColor="text2"/>
+          <w:sz w:val="36"/>
+          <w:szCs w:val="36"/>
+          <w:u w:val="single"/>
+          <w:lang w:val="de-DE"/>
+        </w:rPr>
+        <w:t>Noch nicht fertig.</w:t>
+      </w:r>
+    </w:p>
+    <w:p>
+      <w:pPr>
+        <w:jc w:val="center"/>
+        <w:rPr>
+          <w:rFonts w:ascii="Roboto" w:hAnsi="Roboto"/>
+          <w:color w:val="806000" w:themeColor="accent4" w:themeShade="80"/>
+          <w:sz w:val="36"/>
+          <w:szCs w:val="36"/>
+          <w:lang w:val="de-DE"/>
+        </w:rPr>
+      </w:pPr>
+      <w:r>
+        <w:rPr>
+          <w:rFonts w:ascii="Roboto" w:hAnsi="Roboto"/>
+          <w:color w:val="806000" w:themeColor="accent4" w:themeShade="80"/>
+          <w:sz w:val="36"/>
+          <w:szCs w:val="36"/>
+          <w:lang w:val="de-DE"/>
+        </w:rPr>
+        <w:t>Anionische</w:t>
+      </w:r>
+      <w:r>
+        <w:rPr>
+          <w:rFonts w:ascii="Roboto" w:hAnsi="Roboto"/>
+          <w:color w:val="806000" w:themeColor="accent4" w:themeShade="80"/>
+          <w:sz w:val="36"/>
+          <w:szCs w:val="36"/>
+          <w:lang w:val="de-DE"/>
+        </w:rPr>
+        <w:t xml:space="preserve"> Polymerisation</w:t>
+      </w:r>
+    </w:p>
+    <w:p>
+      <w:pPr>
+        <w:jc w:val="center"/>
+        <w:rPr>
+          <w:rFonts w:ascii="Roboto" w:hAnsi="Roboto"/>
+          <w:i/>
+          <w:iCs/>
+          <w:color w:val="44546A" w:themeColor="text2"/>
+          <w:sz w:val="36"/>
+          <w:szCs w:val="36"/>
+          <w:u w:val="single"/>
+          <w:lang w:val="de-DE"/>
+        </w:rPr>
+      </w:pPr>
+      <w:r>
+        <w:rPr>
+          <w:rFonts w:ascii="Roboto" w:hAnsi="Roboto"/>
+          <w:i/>
+          <w:iCs/>
+          <w:color w:val="44546A" w:themeColor="text2"/>
+          <w:sz w:val="36"/>
+          <w:szCs w:val="36"/>
+          <w:u w:val="single"/>
+          <w:lang w:val="de-DE"/>
+        </w:rPr>
+        <w:t>Noch nicht fertig.</w:t>
+      </w:r>
+    </w:p>
+    <w:p>
+      <w:pPr>
+        <w:jc w:val="center"/>
+        <w:rPr>
+          <w:rFonts w:ascii="Roboto" w:hAnsi="Roboto"/>
           <w:color w:val="FF0000"/>
           <w:sz w:val="40"/>
           <w:szCs w:val="40"/>
           <w:lang w:val="de-DE"/>
         </w:rPr>
       </w:pPr>
+      <w:r>
+        <w:rPr>
+          <w:rFonts w:ascii="Roboto" w:hAnsi="Roboto"/>
+          <w:color w:val="806000" w:themeColor="accent4" w:themeShade="80"/>
+          <w:sz w:val="36"/>
+          <w:szCs w:val="36"/>
+          <w:lang w:val="de-DE"/>
+        </w:rPr>
+        <w:t>Kationische</w:t>
+      </w:r>
+      <w:r>
+        <w:rPr>
+          <w:rFonts w:ascii="Roboto" w:hAnsi="Roboto"/>
+          <w:color w:val="806000" w:themeColor="accent4" w:themeShade="80"/>
+          <w:sz w:val="36"/>
+          <w:szCs w:val="36"/>
+          <w:lang w:val="de-DE"/>
+        </w:rPr>
+        <w:t xml:space="preserve"> Polymerisation</w:t>
+      </w:r>
+    </w:p>
+    <w:p>
+      <w:pPr>
+        <w:jc w:val="center"/>
+        <w:rPr>
+          <w:rFonts w:ascii="Roboto" w:hAnsi="Roboto"/>
+          <w:i/>
+          <w:iCs/>
+          <w:color w:val="44546A" w:themeColor="text2"/>
+          <w:sz w:val="36"/>
+          <w:szCs w:val="36"/>
+          <w:u w:val="single"/>
+          <w:lang w:val="de-DE"/>
+        </w:rPr>
+      </w:pPr>
+      <w:r>
+        <w:rPr>
+          <w:rFonts w:ascii="Roboto" w:hAnsi="Roboto"/>
+          <w:i/>
+          <w:iCs/>
+          <w:color w:val="44546A" w:themeColor="text2"/>
+          <w:sz w:val="36"/>
+          <w:szCs w:val="36"/>
+          <w:u w:val="single"/>
+          <w:lang w:val="de-DE"/>
+        </w:rPr>
+        <w:t>Noch nicht fertig.</w:t>
+      </w:r>
     </w:p>
     <w:p>
       <w:pPr>
@@ -2554,7 +4122,10 @@
           <w:lang w:val="de-DE"/>
         </w:rPr>
       </w:pPr>
-      <w:r>
+    </w:p>
+    <w:p>
+      <w:pPr>
+        <w:jc w:val="center"/>
         <w:rPr>
           <w:rFonts w:ascii="Roboto" w:hAnsi="Roboto"/>
           <w:color w:val="FF0000"/>
@@ -2562,8 +4133,7 @@
           <w:szCs w:val="40"/>
           <w:lang w:val="de-DE"/>
         </w:rPr>
-        <w:t>Polyk</w:t>
-      </w:r>
+      </w:pPr>
       <w:r>
         <w:rPr>
           <w:rFonts w:ascii="Roboto" w:hAnsi="Roboto"/>
@@ -2572,12 +4142,9 @@
           <w:szCs w:val="40"/>
           <w:lang w:val="de-DE"/>
         </w:rPr>
-        <w:t>ondensation</w:t>
-      </w:r>
-    </w:p>
-    <w:p>
-      <w:pPr>
-        <w:jc w:val="center"/>
+        <w:t>Polyk</w:t>
+      </w:r>
+      <w:r>
         <w:rPr>
           <w:rFonts w:ascii="Roboto" w:hAnsi="Roboto"/>
           <w:color w:val="FF0000"/>
@@ -2585,7 +4152,8 @@
           <w:szCs w:val="40"/>
           <w:lang w:val="de-DE"/>
         </w:rPr>
-      </w:pPr>
+        <w:t>ondensation</w:t>
+      </w:r>
     </w:p>
     <w:p>
       <w:pPr>
@@ -2598,7 +4166,36 @@
           <w:lang w:val="de-DE"/>
         </w:rPr>
       </w:pPr>
-      <w:r>
+    </w:p>
+    <w:p>
+      <w:pPr>
+        <w:jc w:val="center"/>
+        <w:rPr>
+          <w:rFonts w:ascii="Algerian" w:hAnsi="Algerian"/>
+          <w:b/>
+          <w:bCs/>
+          <w:color w:val="FF0000"/>
+          <w:sz w:val="48"/>
+          <w:szCs w:val="48"/>
+          <w:lang w:val="de-DE"/>
+        </w:rPr>
+      </w:pPr>
+      <w:r>
+        <w:rPr>
+          <w:rFonts w:ascii="Algerian" w:hAnsi="Algerian"/>
+          <w:b/>
+          <w:bCs/>
+          <w:color w:val="FF0000"/>
+          <w:sz w:val="48"/>
+          <w:szCs w:val="48"/>
+          <w:lang w:val="de-DE"/>
+        </w:rPr>
+        <w:t>Wiederholung</w:t>
+      </w:r>
+    </w:p>
+    <w:p>
+      <w:pPr>
+        <w:jc w:val="center"/>
         <w:rPr>
           <w:rFonts w:ascii="Roboto" w:hAnsi="Roboto"/>
           <w:color w:val="FF0000"/>
@@ -2606,12 +4203,8 @@
           <w:szCs w:val="40"/>
           <w:lang w:val="de-DE"/>
         </w:rPr>
-        <w:t>Wiederholung</w:t>
-      </w:r>
-    </w:p>
-    <w:p>
-      <w:pPr>
-        <w:jc w:val="center"/>
+      </w:pPr>
+      <w:r>
         <w:rPr>
           <w:rFonts w:ascii="Roboto" w:hAnsi="Roboto"/>
           <w:color w:val="FF0000"/>
@@ -2619,15 +4212,7 @@
           <w:szCs w:val="40"/>
           <w:lang w:val="de-DE"/>
         </w:rPr>
-      </w:pPr>
-      <w:r>
-        <w:rPr>
-          <w:rFonts w:ascii="Roboto" w:hAnsi="Roboto"/>
-          <w:color w:val="FF0000"/>
-          <w:sz w:val="40"/>
-          <w:szCs w:val="40"/>
-          <w:lang w:val="de-DE"/>
-        </w:rPr>
+        <w:lastRenderedPageBreak/>
         <w:t>Funktionale Gruppen</w:t>
       </w:r>
     </w:p>
@@ -2878,9 +4463,9 @@
                   <o:lock v:ext="edit" aspectratio="t"/>
                 </v:shapetype>
                 <v:shape id="_x0000_i1025" type="#_x0000_t75" style="width:54.75pt;height:42pt" o:ole="">
-                  <v:imagedata r:id="rId8" o:title=""/>
+                  <v:imagedata r:id="rId14" o:title=""/>
                 </v:shape>
-                <o:OLEObject Type="Embed" ProgID="PBrush" ShapeID="_x0000_i1025" DrawAspect="Content" ObjectID="_1832956391" r:id="rId9"/>
+                <o:OLEObject Type="Embed" ProgID="PBrush" ShapeID="_x0000_i1025" DrawAspect="Content" ObjectID="_1832958017" r:id="rId15"/>
               </w:object>
             </w:r>
           </w:p>
@@ -3050,7 +4635,7 @@
                           </pic:cNvPicPr>
                         </pic:nvPicPr>
                         <pic:blipFill>
-                          <a:blip r:embed="rId10" cstate="print">
+                          <a:blip r:embed="rId16" cstate="print">
                             <a:extLst>
                               <a:ext uri="{28A0092B-C50C-407E-A947-70E740481C1C}">
                                 <a14:useLocalDpi xmlns:a14="http://schemas.microsoft.com/office/drawing/2010/main" val="0"/>
@@ -3220,9 +4805,9 @@
               </w:rPr>
               <w:object w:dxaOrig="4320" w:dyaOrig="3972" w14:anchorId="4F229714">
                 <v:shape id="_x0000_i1026" type="#_x0000_t75" style="width:57pt;height:45.75pt" o:ole="">
-                  <v:imagedata r:id="rId11" o:title=""/>
+                  <v:imagedata r:id="rId17" o:title=""/>
                 </v:shape>
-                <o:OLEObject Type="Embed" ProgID="PBrush" ShapeID="_x0000_i1026" DrawAspect="Content" ObjectID="_1832956392" r:id="rId12"/>
+                <o:OLEObject Type="Embed" ProgID="PBrush" ShapeID="_x0000_i1026" DrawAspect="Content" ObjectID="_1832958018" r:id="rId18"/>
               </w:object>
             </w:r>
           </w:p>
@@ -3384,9 +4969,9 @@
               </w:rPr>
               <w:object w:dxaOrig="3240" w:dyaOrig="3375" w14:anchorId="7D0ACAF4">
                 <v:shape id="_x0000_i1027" type="#_x0000_t75" style="width:57pt;height:59.25pt" o:ole="">
-                  <v:imagedata r:id="rId13" o:title=""/>
+                  <v:imagedata r:id="rId19" o:title=""/>
                 </v:shape>
-                <o:OLEObject Type="Embed" ProgID="PBrush" ShapeID="_x0000_i1027" DrawAspect="Content" ObjectID="_1832956393" r:id="rId14"/>
+                <o:OLEObject Type="Embed" ProgID="PBrush" ShapeID="_x0000_i1027" DrawAspect="Content" ObjectID="_1832958019" r:id="rId20"/>
               </w:object>
             </w:r>
           </w:p>
@@ -3548,9 +5133,9 @@
               </w:rPr>
               <w:object w:dxaOrig="3465" w:dyaOrig="3645" w14:anchorId="2218FA0A">
                 <v:shape id="_x0000_i1028" type="#_x0000_t75" style="width:44.25pt;height:47.25pt" o:ole="">
-                  <v:imagedata r:id="rId15" o:title=""/>
+                  <v:imagedata r:id="rId21" o:title=""/>
                 </v:shape>
-                <o:OLEObject Type="Embed" ProgID="PBrush" ShapeID="_x0000_i1028" DrawAspect="Content" ObjectID="_1832956394" r:id="rId16"/>
+                <o:OLEObject Type="Embed" ProgID="PBrush" ShapeID="_x0000_i1028" DrawAspect="Content" ObjectID="_1832958020" r:id="rId22"/>
               </w:object>
             </w:r>
           </w:p>
@@ -3712,9 +5297,9 @@
               </w:rPr>
               <w:object w:dxaOrig="3900" w:dyaOrig="1620" w14:anchorId="333D0DCD">
                 <v:shape id="_x0000_i1029" type="#_x0000_t75" style="width:48.75pt;height:21pt" o:ole="">
-                  <v:imagedata r:id="rId17" o:title=""/>
+                  <v:imagedata r:id="rId23" o:title=""/>
                 </v:shape>
-                <o:OLEObject Type="Embed" ProgID="PBrush" ShapeID="_x0000_i1029" DrawAspect="Content" ObjectID="_1832956395" r:id="rId18"/>
+                <o:OLEObject Type="Embed" ProgID="PBrush" ShapeID="_x0000_i1029" DrawAspect="Content" ObjectID="_1832958021" r:id="rId24"/>
               </w:object>
             </w:r>
           </w:p>
@@ -4008,9 +5593,9 @@
               </w:rPr>
               <w:object w:dxaOrig="4665" w:dyaOrig="10995" w14:anchorId="484745D7">
                 <v:shape id="_x0000_i1030" type="#_x0000_t75" style="width:23.25pt;height:56.25pt" o:ole="">
-                  <v:imagedata r:id="rId19" o:title=""/>
+                  <v:imagedata r:id="rId25" o:title=""/>
                 </v:shape>
-                <o:OLEObject Type="Embed" ProgID="PBrush" ShapeID="_x0000_i1030" DrawAspect="Content" ObjectID="_1832956396" r:id="rId20"/>
+                <o:OLEObject Type="Embed" ProgID="PBrush" ShapeID="_x0000_i1030" DrawAspect="Content" ObjectID="_1832958022" r:id="rId26"/>
               </w:object>
             </w:r>
           </w:p>
@@ -4061,7 +5646,6 @@
                 <w:szCs w:val="20"/>
                 <w:lang w:val="de-DE"/>
               </w:rPr>
-              <w:lastRenderedPageBreak/>
               <w:t>Amine</w:t>
             </w:r>
           </w:p>
@@ -4134,9 +5718,9 @@
               </w:rPr>
               <w:object w:dxaOrig="1785" w:dyaOrig="2040" w14:anchorId="714F372C">
                 <v:shape id="_x0000_i1031" type="#_x0000_t75" style="width:51.75pt;height:58.5pt" o:ole="">
-                  <v:imagedata r:id="rId21" o:title=""/>
+                  <v:imagedata r:id="rId27" o:title=""/>
                 </v:shape>
-                <o:OLEObject Type="Embed" ProgID="PBrush" ShapeID="_x0000_i1031" DrawAspect="Content" ObjectID="_1832956397" r:id="rId22"/>
+                <o:OLEObject Type="Embed" ProgID="PBrush" ShapeID="_x0000_i1031" DrawAspect="Content" ObjectID="_1832958023" r:id="rId28"/>
               </w:object>
             </w:r>
           </w:p>
@@ -4292,7 +5876,7 @@
                           </pic:cNvPicPr>
                         </pic:nvPicPr>
                         <pic:blipFill>
-                          <a:blip r:embed="rId23" cstate="print">
+                          <a:blip r:embed="rId29" cstate="print">
                             <a:extLst>
                               <a:ext uri="{28A0092B-C50C-407E-A947-70E740481C1C}">
                                 <a14:useLocalDpi xmlns:a14="http://schemas.microsoft.com/office/drawing/2010/main" val="0"/>
@@ -4547,6 +6131,7 @@
           <w:szCs w:val="32"/>
           <w:lang w:val="de-DE"/>
         </w:rPr>
+        <w:lastRenderedPageBreak/>
         <w:t>Wasserstoffatome</w:t>
       </w:r>
       <w:r>
@@ -4700,7 +6285,7 @@
                     </pic:cNvPicPr>
                   </pic:nvPicPr>
                   <pic:blipFill>
-                    <a:blip r:embed="rId24">
+                    <a:blip r:embed="rId30">
                       <a:extLst>
                         <a:ext uri="{28A0092B-C50C-407E-A947-70E740481C1C}">
                           <a14:useLocalDpi xmlns:a14="http://schemas.microsoft.com/office/drawing/2010/main" val="0"/>
@@ -4848,7 +6433,7 @@
                     </pic:cNvPicPr>
                   </pic:nvPicPr>
                   <pic:blipFill>
-                    <a:blip r:embed="rId25" cstate="print">
+                    <a:blip r:embed="rId31" cstate="print">
                       <a:extLst>
                         <a:ext uri="{28A0092B-C50C-407E-A947-70E740481C1C}">
                           <a14:useLocalDpi xmlns:a14="http://schemas.microsoft.com/office/drawing/2010/main" val="0"/>
@@ -4901,7 +6486,6 @@
           <w:szCs w:val="32"/>
           <w:lang w:val="de-DE"/>
         </w:rPr>
-        <w:lastRenderedPageBreak/>
         <w:t>Doppelbindungen</w:t>
       </w:r>
       <w:r>
@@ -5092,7 +6676,7 @@
                     <pic:cNvPicPr/>
                   </pic:nvPicPr>
                   <pic:blipFill>
-                    <a:blip r:embed="rId26"/>
+                    <a:blip r:embed="rId32"/>
                     <a:stretch>
                       <a:fillRect/>
                     </a:stretch>
@@ -5147,7 +6731,7 @@
                     <pic:cNvPicPr/>
                   </pic:nvPicPr>
                   <pic:blipFill>
-                    <a:blip r:embed="rId27"/>
+                    <a:blip r:embed="rId33"/>
                     <a:stretch>
                       <a:fillRect/>
                     </a:stretch>
@@ -5452,6 +7036,7 @@
           <w:szCs w:val="32"/>
           <w:lang w:val="de-DE"/>
         </w:rPr>
+        <w:lastRenderedPageBreak/>
         <w:drawing>
           <wp:inline distT="0" distB="0" distL="0" distR="0" wp14:anchorId="5D235E15" wp14:editId="30DD325B">
             <wp:extent cx="5760720" cy="2122170"/>
@@ -5468,7 +7053,7 @@
                     <pic:cNvPicPr/>
                   </pic:nvPicPr>
                   <pic:blipFill>
-                    <a:blip r:embed="rId28"/>
+                    <a:blip r:embed="rId34"/>
                     <a:stretch>
                       <a:fillRect/>
                     </a:stretch>
@@ -5725,7 +7310,6 @@
           <w:szCs w:val="32"/>
           <w:lang w:val="de-DE"/>
         </w:rPr>
-        <w:lastRenderedPageBreak/>
         <w:drawing>
           <wp:inline distT="0" distB="0" distL="0" distR="0" wp14:anchorId="30E1A806" wp14:editId="5BF7B549">
             <wp:extent cx="2964837" cy="1000125"/>
@@ -5742,7 +7326,7 @@
                     <pic:cNvPicPr/>
                   </pic:nvPicPr>
                   <pic:blipFill>
-                    <a:blip r:embed="rId29"/>
+                    <a:blip r:embed="rId35"/>
                     <a:stretch>
                       <a:fillRect/>
                     </a:stretch>
@@ -6214,6 +7798,7 @@
           <w:szCs w:val="32"/>
           <w:lang w:val="de-DE"/>
         </w:rPr>
+        <w:lastRenderedPageBreak/>
         <w:t xml:space="preserve">Bedingung: </w:t>
       </w:r>
       <w:r>
@@ -7073,7 +8658,7 @@
                     </pic:cNvPicPr>
                   </pic:nvPicPr>
                   <pic:blipFill>
-                    <a:blip r:embed="rId30">
+                    <a:blip r:embed="rId36">
                       <a:extLst>
                         <a:ext uri="{28A0092B-C50C-407E-A947-70E740481C1C}">
                           <a14:useLocalDpi xmlns:a14="http://schemas.microsoft.com/office/drawing/2010/main" val="0"/>
@@ -7233,7 +8818,6 @@
           <w:szCs w:val="24"/>
           <w:lang w:val="de-DE"/>
         </w:rPr>
-        <w:lastRenderedPageBreak/>
         <w:t>Das</w:t>
       </w:r>
       <w:r>
@@ -7606,7 +9190,7 @@
                     </pic:cNvPicPr>
                   </pic:nvPicPr>
                   <pic:blipFill>
-                    <a:blip r:embed="rId31">
+                    <a:blip r:embed="rId37">
                       <a:extLst>
                         <a:ext uri="{28A0092B-C50C-407E-A947-70E740481C1C}">
                           <a14:useLocalDpi xmlns:a14="http://schemas.microsoft.com/office/drawing/2010/main" val="0"/>
@@ -7809,6 +9393,7 @@
           <w:u w:val="single"/>
           <w:lang w:val="de-DE"/>
         </w:rPr>
+        <w:lastRenderedPageBreak/>
         <w:t>Wasserstoffbrücken (am stärksten)</w:t>
       </w:r>
     </w:p>
@@ -7879,7 +9464,7 @@
                     </pic:cNvPicPr>
                   </pic:nvPicPr>
                   <pic:blipFill>
-                    <a:blip r:embed="rId32">
+                    <a:blip r:embed="rId38">
                       <a:extLst>
                         <a:ext uri="{28A0092B-C50C-407E-A947-70E740481C1C}">
                           <a14:useLocalDpi xmlns:a14="http://schemas.microsoft.com/office/drawing/2010/main" val="0"/>
@@ -8162,7 +9747,6 @@
           <w:szCs w:val="40"/>
           <w:lang w:val="de-DE"/>
         </w:rPr>
-        <w:lastRenderedPageBreak/>
         <w:drawing>
           <wp:inline distT="0" distB="0" distL="0" distR="0" wp14:anchorId="5E2E421D" wp14:editId="2FAB3DFC">
             <wp:extent cx="4044523" cy="1709530"/>
@@ -8181,7 +9765,7 @@
                     </pic:cNvPicPr>
                   </pic:nvPicPr>
                   <pic:blipFill>
-                    <a:blip r:embed="rId33" cstate="print">
+                    <a:blip r:embed="rId39" cstate="print">
                       <a:extLst>
                         <a:ext uri="{28A0092B-C50C-407E-A947-70E740481C1C}">
                           <a14:useLocalDpi xmlns:a14="http://schemas.microsoft.com/office/drawing/2010/main" val="0"/>
@@ -8251,7 +9835,7 @@
                     </pic:cNvPicPr>
                   </pic:nvPicPr>
                   <pic:blipFill>
-                    <a:blip r:embed="rId34">
+                    <a:blip r:embed="rId40">
                       <a:extLst>
                         <a:ext uri="{28A0092B-C50C-407E-A947-70E740481C1C}">
                           <a14:useLocalDpi xmlns:a14="http://schemas.microsoft.com/office/drawing/2010/main" val="0"/>
@@ -8339,6 +9923,7 @@
           <w:noProof/>
           <w:lang w:val="de-DE"/>
         </w:rPr>
+        <w:lastRenderedPageBreak/>
         <w:drawing>
           <wp:inline distT="0" distB="0" distL="0" distR="0" wp14:anchorId="195DB921" wp14:editId="3B93DCCA">
             <wp:extent cx="5760720" cy="1572260"/>
@@ -8357,7 +9942,7 @@
                     </pic:cNvPicPr>
                   </pic:nvPicPr>
                   <pic:blipFill>
-                    <a:blip r:embed="rId35">
+                    <a:blip r:embed="rId41">
                       <a:extLst>
                         <a:ext uri="{28A0092B-C50C-407E-A947-70E740481C1C}">
                           <a14:useLocalDpi xmlns:a14="http://schemas.microsoft.com/office/drawing/2010/main" val="0"/>
@@ -8573,7 +10158,6 @@
           <w:szCs w:val="32"/>
           <w:lang w:val="de-DE"/>
         </w:rPr>
-        <w:lastRenderedPageBreak/>
         <w:drawing>
           <wp:inline distT="0" distB="0" distL="0" distR="0" wp14:anchorId="3289F4E5" wp14:editId="7184C1EA">
             <wp:extent cx="5931352" cy="1496568"/>
@@ -8590,7 +10174,7 @@
                     <pic:cNvPicPr/>
                   </pic:nvPicPr>
                   <pic:blipFill>
-                    <a:blip r:embed="rId36"/>
+                    <a:blip r:embed="rId42"/>
                     <a:stretch>
                       <a:fillRect/>
                     </a:stretch>
@@ -8826,6 +10410,7 @@
           <w:szCs w:val="32"/>
           <w:lang w:val="de-DE"/>
         </w:rPr>
+        <w:lastRenderedPageBreak/>
         <w:t xml:space="preserve">Typischer Angreifer: </w:t>
       </w:r>
       <w:r>
@@ -8928,7 +10513,7 @@
                     <pic:cNvPicPr/>
                   </pic:nvPicPr>
                   <pic:blipFill>
-                    <a:blip r:embed="rId37"/>
+                    <a:blip r:embed="rId43"/>
                     <a:stretch>
                       <a:fillRect/>
                     </a:stretch>
@@ -9044,7 +10629,6 @@
           <w:szCs w:val="32"/>
           <w:lang w:val="de-DE"/>
         </w:rPr>
-        <w:lastRenderedPageBreak/>
         <w:t>Typischer Angreifer: Nukleophil greift an (z. B.: OH-, CN-)</w:t>
       </w:r>
     </w:p>
@@ -9142,7 +10726,7 @@
                     <pic:cNvPicPr/>
                   </pic:nvPicPr>
                   <pic:blipFill>
-                    <a:blip r:embed="rId38"/>
+                    <a:blip r:embed="rId44"/>
                     <a:stretch>
                       <a:fillRect/>
                     </a:stretch>
@@ -9288,6 +10872,7 @@
           <w:szCs w:val="24"/>
           <w:lang w:val="de-DE"/>
         </w:rPr>
+        <w:lastRenderedPageBreak/>
         <w:t>Alkene</w:t>
       </w:r>
       <w:r>
@@ -9986,7 +11571,6 @@
           <w:szCs w:val="32"/>
           <w:lang w:val="de-DE"/>
         </w:rPr>
-        <w:lastRenderedPageBreak/>
         <w:t xml:space="preserve">Ein </w:t>
       </w:r>
       <w:r>
@@ -10243,7 +11827,7 @@
                     </pic:cNvPicPr>
                   </pic:nvPicPr>
                   <pic:blipFill>
-                    <a:blip r:embed="rId39">
+                    <a:blip r:embed="rId45">
                       <a:extLst>
                         <a:ext uri="{28A0092B-C50C-407E-A947-70E740481C1C}">
                           <a14:useLocalDpi xmlns:a14="http://schemas.microsoft.com/office/drawing/2010/main" val="0"/>
@@ -10588,6 +12172,7 @@
           <w:szCs w:val="32"/>
           <w:lang w:val="de-DE"/>
         </w:rPr>
+        <w:lastRenderedPageBreak/>
         <w:t xml:space="preserve">Bei einer Additionsreaktion mit Säure greift das </w:t>
       </w:r>
       <w:r>
@@ -10752,7 +12337,7 @@
                     </pic:cNvPicPr>
                   </pic:nvPicPr>
                   <pic:blipFill>
-                    <a:blip r:embed="rId40">
+                    <a:blip r:embed="rId46">
                       <a:extLst>
                         <a:ext uri="{28A0092B-C50C-407E-A947-70E740481C1C}">
                           <a14:useLocalDpi xmlns:a14="http://schemas.microsoft.com/office/drawing/2010/main" val="0"/>
@@ -10801,7 +12386,6 @@
           <w:szCs w:val="32"/>
           <w:lang w:val="de-DE"/>
         </w:rPr>
-        <w:lastRenderedPageBreak/>
         <w:t xml:space="preserve">Danach greift das übrig </w:t>
       </w:r>
       <w:r>
@@ -10916,7 +12500,7 @@
                     </pic:cNvPicPr>
                   </pic:nvPicPr>
                   <pic:blipFill>
-                    <a:blip r:embed="rId41">
+                    <a:blip r:embed="rId47">
                       <a:extLst>
                         <a:ext uri="{28A0092B-C50C-407E-A947-70E740481C1C}">
                           <a14:useLocalDpi xmlns:a14="http://schemas.microsoft.com/office/drawing/2010/main" val="0"/>
@@ -11247,6 +12831,7 @@
           <w:szCs w:val="32"/>
           <w:lang w:val="de-DE"/>
         </w:rPr>
+        <w:lastRenderedPageBreak/>
         <w:t>Das</w:t>
       </w:r>
       <w:r>
@@ -11446,7 +13031,7 @@
                     </pic:cNvPicPr>
                   </pic:nvPicPr>
                   <pic:blipFill>
-                    <a:blip r:embed="rId42">
+                    <a:blip r:embed="rId48">
                       <a:extLst>
                         <a:ext uri="{28A0092B-C50C-407E-A947-70E740481C1C}">
                           <a14:useLocalDpi xmlns:a14="http://schemas.microsoft.com/office/drawing/2010/main" val="0"/>
@@ -11495,7 +13080,6 @@
           <w:szCs w:val="32"/>
           <w:lang w:val="de-DE"/>
         </w:rPr>
-        <w:lastRenderedPageBreak/>
         <w:t xml:space="preserve">Danach greift </w:t>
       </w:r>
       <w:r>
@@ -11618,7 +13202,7 @@
                     </pic:cNvPicPr>
                   </pic:nvPicPr>
                   <pic:blipFill>
-                    <a:blip r:embed="rId43">
+                    <a:blip r:embed="rId49">
                       <a:extLst>
                         <a:ext uri="{28A0092B-C50C-407E-A947-70E740481C1C}">
                           <a14:useLocalDpi xmlns:a14="http://schemas.microsoft.com/office/drawing/2010/main" val="0"/>
@@ -11819,7 +13403,7 @@
                     </pic:cNvPicPr>
                   </pic:nvPicPr>
                   <pic:blipFill>
-                    <a:blip r:embed="rId44">
+                    <a:blip r:embed="rId50">
                       <a:extLst>
                         <a:ext uri="{28A0092B-C50C-407E-A947-70E740481C1C}">
                           <a14:useLocalDpi xmlns:a14="http://schemas.microsoft.com/office/drawing/2010/main" val="0"/>
@@ -12023,6 +13607,7 @@
           <w:szCs w:val="32"/>
           <w:lang w:val="de-DE"/>
         </w:rPr>
+        <w:lastRenderedPageBreak/>
         <w:t xml:space="preserve"> </w:t>
       </w:r>
       <w:r>
@@ -12197,7 +13782,7 @@
                     </pic:cNvPicPr>
                   </pic:nvPicPr>
                   <pic:blipFill>
-                    <a:blip r:embed="rId45">
+                    <a:blip r:embed="rId51">
                       <a:extLst>
                         <a:ext uri="{28A0092B-C50C-407E-A947-70E740481C1C}">
                           <a14:useLocalDpi xmlns:a14="http://schemas.microsoft.com/office/drawing/2010/main" val="0"/>
@@ -12246,7 +13831,6 @@
           <w:szCs w:val="32"/>
           <w:lang w:val="de-DE"/>
         </w:rPr>
-        <w:lastRenderedPageBreak/>
         <w:t xml:space="preserve">Das </w:t>
       </w:r>
       <w:r>
@@ -12432,7 +14016,7 @@
                     </pic:cNvPicPr>
                   </pic:nvPicPr>
                   <pic:blipFill>
-                    <a:blip r:embed="rId46">
+                    <a:blip r:embed="rId52">
                       <a:extLst>
                         <a:ext uri="{28A0092B-C50C-407E-A947-70E740481C1C}">
                           <a14:useLocalDpi xmlns:a14="http://schemas.microsoft.com/office/drawing/2010/main" val="0"/>
@@ -12615,7 +14199,7 @@
                     </pic:cNvPicPr>
                   </pic:nvPicPr>
                   <pic:blipFill>
-                    <a:blip r:embed="rId47">
+                    <a:blip r:embed="rId53">
                       <a:extLst>
                         <a:ext uri="{28A0092B-C50C-407E-A947-70E740481C1C}">
                           <a14:useLocalDpi xmlns:a14="http://schemas.microsoft.com/office/drawing/2010/main" val="0"/>
@@ -12761,6 +14345,7 @@
           <w:szCs w:val="32"/>
           <w:lang w:val="de-DE"/>
         </w:rPr>
+        <w:lastRenderedPageBreak/>
         <w:t>Ester</w:t>
       </w:r>
       <w:r>
@@ -12874,7 +14459,6 @@
           <w:szCs w:val="32"/>
           <w:lang w:val="de-DE"/>
         </w:rPr>
-        <w:lastRenderedPageBreak/>
         <w:drawing>
           <wp:inline distT="0" distB="0" distL="0" distR="0" wp14:anchorId="34F3E4EA" wp14:editId="0BA1B4A9">
             <wp:extent cx="5753735" cy="2167255"/>
@@ -12893,7 +14477,7 @@
                     </pic:cNvPicPr>
                   </pic:nvPicPr>
                   <pic:blipFill>
-                    <a:blip r:embed="rId48">
+                    <a:blip r:embed="rId54">
                       <a:extLst>
                         <a:ext uri="{28A0092B-C50C-407E-A947-70E740481C1C}">
                           <a14:useLocalDpi xmlns:a14="http://schemas.microsoft.com/office/drawing/2010/main" val="0"/>
@@ -13158,7 +14742,7 @@
                     <pic:cNvPicPr/>
                   </pic:nvPicPr>
                   <pic:blipFill>
-                    <a:blip r:embed="rId49"/>
+                    <a:blip r:embed="rId55"/>
                     <a:stretch>
                       <a:fillRect/>
                     </a:stretch>
@@ -13342,6 +14926,7 @@
           <w:szCs w:val="32"/>
           <w:lang w:val="de-DE"/>
         </w:rPr>
+        <w:lastRenderedPageBreak/>
         <w:t>Veresterung</w:t>
       </w:r>
       <w:r>
@@ -13486,7 +15071,6 @@
           <w:szCs w:val="32"/>
           <w:lang w:val="de-DE"/>
         </w:rPr>
-        <w:lastRenderedPageBreak/>
         <w:drawing>
           <wp:inline distT="0" distB="0" distL="0" distR="0" wp14:anchorId="25BFE244" wp14:editId="4D5802AD">
             <wp:extent cx="3474720" cy="2602904"/>
@@ -13503,7 +15087,7 @@
                     <pic:cNvPicPr/>
                   </pic:nvPicPr>
                   <pic:blipFill>
-                    <a:blip r:embed="rId50"/>
+                    <a:blip r:embed="rId56"/>
                     <a:stretch>
                       <a:fillRect/>
                     </a:stretch>
@@ -14831,6 +16415,7 @@
           <w:szCs w:val="32"/>
           <w:lang w:val="de-DE"/>
         </w:rPr>
+        <w:lastRenderedPageBreak/>
         <w:sym w:font="Wingdings" w:char="F0E0"/>
       </w:r>
       <w:r>
@@ -15277,12 +16862,11 @@
   <w:style w:type="paragraph" w:default="1" w:styleId="Normal">
     <w:name w:val="Normal"/>
     <w:qFormat/>
-    <w:rsid w:val="006D6EAC"/>
+    <w:rsid w:val="00DE037C"/>
   </w:style>
   <w:style w:type="character" w:default="1" w:styleId="VarsaylanParagrafYazTipi">
     <w:name w:val="Default Paragraph Font"/>
     <w:uiPriority w:val="1"/>
-    <w:semiHidden/>
     <w:unhideWhenUsed/>
   </w:style>
   <w:style w:type="table" w:default="1" w:styleId="NormalTablo">
@@ -15324,6 +16908,17 @@
         <w:insideV w:val="single" w:sz="4" w:space="0" w:color="auto"/>
       </w:tblBorders>
     </w:tblPr>
+  </w:style>
+  <w:style w:type="paragraph" w:styleId="ListeParagraf">
+    <w:name w:val="List Paragraph"/>
+    <w:basedOn w:val="Normal"/>
+    <w:uiPriority w:val="34"/>
+    <w:qFormat/>
+    <w:rsid w:val="00AB0778"/>
+    <w:pPr>
+      <w:ind w:left="720"/>
+      <w:contextualSpacing/>
+    </w:pPr>
   </w:style>
 </w:styles>
 </file>
@@ -15621,4 +17216,16 @@
     </a:ext>
   </a:extLst>
 </a:theme>
+</file>
+
+<file path=customXml/item1.xml><?xml version="1.0" encoding="utf-8"?>
+<b:Sources xmlns:b="http://schemas.openxmlformats.org/officeDocument/2006/bibliography" xmlns="http://schemas.openxmlformats.org/officeDocument/2006/bibliography" SelectedStyle="\APASixthEditionOfficeOnline.xsl" StyleName="APA" Version="6"/>
+</file>
+
+<file path=customXml/itemProps1.xml><?xml version="1.0" encoding="utf-8"?>
+<ds:datastoreItem xmlns:ds="http://schemas.openxmlformats.org/officeDocument/2006/customXml" ds:itemID="{DA0C65F5-751C-4833-8548-E7880A8562D3}">
+  <ds:schemaRefs>
+    <ds:schemaRef ds:uri="http://schemas.openxmlformats.org/officeDocument/2006/bibliography"/>
+  </ds:schemaRefs>
+</ds:datastoreItem>
 </file>
</xml_diff>